<commit_message>
manuscript introduction, almost up until study system (woohoo)
</commit_message>
<xml_diff>
--- a/documents/thesis manuscript/manuscript_260317.docx
+++ b/documents/thesis manuscript/manuscript_260317.docx
@@ -222,8 +222,44 @@
         <w:rPr>
           <w:rFonts w:ascii="Times New Roman" w:hAnsi="Times New Roman" w:cs="Times New Roman"/>
         </w:rPr>
-        <w:t>Add: genetic variation &amp; influence on ecology; dan bolnick and randel hughes</w:t>
-      </w:r>
+        <w:t xml:space="preserve">Add: genetic variation &amp; influence on ecology; dan </w:t>
+      </w:r>
+      <w:proofErr w:type="spellStart"/>
+      <w:r>
+        <w:rPr>
+          <w:rFonts w:ascii="Times New Roman" w:hAnsi="Times New Roman" w:cs="Times New Roman"/>
+        </w:rPr>
+        <w:t>bolnick</w:t>
+      </w:r>
+      <w:proofErr w:type="spellEnd"/>
+      <w:r>
+        <w:rPr>
+          <w:rFonts w:ascii="Times New Roman" w:hAnsi="Times New Roman" w:cs="Times New Roman"/>
+        </w:rPr>
+        <w:t xml:space="preserve"> and </w:t>
+      </w:r>
+      <w:proofErr w:type="spellStart"/>
+      <w:r>
+        <w:rPr>
+          <w:rFonts w:ascii="Times New Roman" w:hAnsi="Times New Roman" w:cs="Times New Roman"/>
+        </w:rPr>
+        <w:t>randel</w:t>
+      </w:r>
+      <w:proofErr w:type="spellEnd"/>
+      <w:r>
+        <w:rPr>
+          <w:rFonts w:ascii="Times New Roman" w:hAnsi="Times New Roman" w:cs="Times New Roman"/>
+        </w:rPr>
+        <w:t xml:space="preserve"> </w:t>
+      </w:r>
+      <w:proofErr w:type="spellStart"/>
+      <w:r>
+        <w:rPr>
+          <w:rFonts w:ascii="Times New Roman" w:hAnsi="Times New Roman" w:cs="Times New Roman"/>
+        </w:rPr>
+        <w:t>hughes</w:t>
+      </w:r>
+      <w:proofErr w:type="spellEnd"/>
     </w:p>
     <w:p>
       <w:pPr>
@@ -737,131 +773,605 @@
         </w:rPr>
         <w:t>he potential for populations to evolve at a rate commensurate with climate change is dependent on several factors.</w:t>
       </w:r>
-    </w:p>
-    <w:p>
-      <w:pPr>
-        <w:spacing w:after="0" w:line="240" w:lineRule="auto"/>
-        <w:rPr>
-          <w:rFonts w:ascii="Times New Roman" w:hAnsi="Times New Roman" w:cs="Times New Roman"/>
-        </w:rPr>
-      </w:pPr>
-    </w:p>
-    <w:p>
-      <w:pPr>
-        <w:spacing w:after="0" w:line="240" w:lineRule="auto"/>
-        <w:rPr>
-          <w:rFonts w:ascii="Times New Roman" w:hAnsi="Times New Roman" w:cs="Times New Roman"/>
-        </w:rPr>
-      </w:pPr>
-      <w:r>
-        <w:rPr>
-          <w:rFonts w:ascii="Times New Roman" w:hAnsi="Times New Roman" w:cs="Times New Roman"/>
-        </w:rPr>
-        <w:t>What determines adaptive potential?</w:t>
-      </w:r>
-    </w:p>
-    <w:p>
-      <w:pPr>
-        <w:numPr>
-          <w:ilvl w:val="0"/>
-          <w:numId w:val="6"/>
-        </w:numPr>
-        <w:spacing w:after="0" w:line="240" w:lineRule="auto"/>
-        <w:rPr>
-          <w:rFonts w:ascii="Times New Roman" w:hAnsi="Times New Roman" w:cs="Times New Roman"/>
-        </w:rPr>
-      </w:pPr>
-      <w:r>
-        <w:rPr>
-          <w:rFonts w:ascii="Times New Roman" w:hAnsi="Times New Roman" w:cs="Times New Roman"/>
-        </w:rPr>
-        <w:t>strength of selection</w:t>
-      </w:r>
-      <w:r>
-        <w:rPr>
-          <w:rFonts w:ascii="Times New Roman" w:hAnsi="Times New Roman" w:cs="Times New Roman"/>
-        </w:rPr>
-        <w:t>, heritability, generation time, standing variation</w:t>
-      </w:r>
-    </w:p>
-    <w:p>
-      <w:pPr>
-        <w:numPr>
-          <w:ilvl w:val="0"/>
-          <w:numId w:val="7"/>
-        </w:numPr>
-        <w:spacing w:after="0" w:line="240" w:lineRule="auto"/>
-        <w:rPr>
-          <w:rFonts w:ascii="Times New Roman" w:hAnsi="Times New Roman" w:cs="Times New Roman"/>
-        </w:rPr>
-      </w:pPr>
-      <w:r>
-        <w:rPr>
-          <w:rFonts w:ascii="Times New Roman" w:hAnsi="Times New Roman" w:cs="Times New Roman"/>
-        </w:rPr>
-        <w:t>Without sufficient variation, selection cannot act</w:t>
-      </w:r>
-    </w:p>
-    <w:p>
-      <w:pPr>
-        <w:numPr>
-          <w:ilvl w:val="0"/>
-          <w:numId w:val="8"/>
-        </w:numPr>
-        <w:spacing w:after="0" w:line="240" w:lineRule="auto"/>
-        <w:rPr>
-          <w:rFonts w:ascii="Times New Roman" w:hAnsi="Times New Roman" w:cs="Times New Roman"/>
-        </w:rPr>
-      </w:pPr>
-      <w:r>
-        <w:rPr>
-          <w:rFonts w:ascii="Times New Roman" w:hAnsi="Times New Roman" w:cs="Times New Roman"/>
-        </w:rPr>
-        <w:t>Thermal performance traits are central under climate change</w:t>
-      </w:r>
-    </w:p>
-    <w:p>
-      <w:pPr>
-        <w:spacing w:after="0" w:line="240" w:lineRule="auto"/>
-        <w:rPr>
-          <w:rFonts w:ascii="Times New Roman" w:hAnsi="Times New Roman" w:cs="Times New Roman"/>
-        </w:rPr>
-      </w:pPr>
-      <w:r>
-        <w:rPr>
-          <w:rFonts w:ascii="Times New Roman" w:hAnsi="Times New Roman" w:cs="Times New Roman"/>
-        </w:rPr>
-        <w:t>But variation isn’t just about how much — it’s also about how it is structured</w:t>
-      </w:r>
-    </w:p>
-    <w:p>
-      <w:pPr>
-        <w:spacing w:after="0" w:line="240" w:lineRule="auto"/>
-        <w:rPr>
-          <w:rFonts w:ascii="Times New Roman" w:hAnsi="Times New Roman" w:cs="Times New Roman"/>
-        </w:rPr>
-      </w:pPr>
-    </w:p>
-    <w:p>
-      <w:pPr>
-        <w:spacing w:after="0" w:line="240" w:lineRule="auto"/>
-        <w:rPr>
-          <w:rFonts w:ascii="Times New Roman" w:hAnsi="Times New Roman" w:cs="Times New Roman"/>
-        </w:rPr>
-      </w:pPr>
-      <w:r>
-        <w:rPr>
-          <w:rFonts w:ascii="Times New Roman" w:hAnsi="Times New Roman" w:cs="Times New Roman"/>
-        </w:rPr>
-        <w:t>Historical shift from trait means to intraspecific variation</w:t>
-      </w:r>
+      <w:r>
+        <w:rPr>
+          <w:rFonts w:ascii="Times New Roman" w:hAnsi="Times New Roman" w:cs="Times New Roman"/>
+        </w:rPr>
+        <w:t xml:space="preserve"> These factors include the strength of selection </w:t>
+      </w:r>
+      <w:r>
+        <w:rPr>
+          <w:rFonts w:ascii="Times New Roman" w:hAnsi="Times New Roman" w:cs="Times New Roman"/>
+        </w:rPr>
+        <w:t>on traits</w:t>
+      </w:r>
+      <w:r>
+        <w:rPr>
+          <w:rFonts w:ascii="Times New Roman" w:hAnsi="Times New Roman" w:cs="Times New Roman"/>
+        </w:rPr>
+        <w:t>, the heritability of those traits, generation time of the organism, and standing</w:t>
+      </w:r>
+      <w:r>
+        <w:rPr>
+          <w:rFonts w:ascii="Times New Roman" w:hAnsi="Times New Roman" w:cs="Times New Roman"/>
+        </w:rPr>
+        <w:t xml:space="preserve"> genetic</w:t>
+      </w:r>
+      <w:r>
+        <w:rPr>
+          <w:rFonts w:ascii="Times New Roman" w:hAnsi="Times New Roman" w:cs="Times New Roman"/>
+        </w:rPr>
+        <w:t xml:space="preserve"> variation.</w:t>
+      </w:r>
+    </w:p>
+    <w:p>
+      <w:pPr>
+        <w:spacing w:after="0" w:line="240" w:lineRule="auto"/>
+        <w:rPr>
+          <w:rFonts w:ascii="Times New Roman" w:hAnsi="Times New Roman" w:cs="Times New Roman"/>
+        </w:rPr>
+      </w:pPr>
+    </w:p>
+    <w:p>
+      <w:pPr>
+        <w:spacing w:after="0" w:line="240" w:lineRule="auto"/>
+        <w:rPr>
+          <w:rFonts w:ascii="Times New Roman" w:hAnsi="Times New Roman" w:cs="Times New Roman"/>
+        </w:rPr>
+      </w:pPr>
+      <w:r>
+        <w:rPr>
+          <w:rFonts w:ascii="Times New Roman" w:hAnsi="Times New Roman" w:cs="Times New Roman"/>
+        </w:rPr>
+        <w:t xml:space="preserve">Standing genetic variation, or the intraspecific diversity of a trait within a population, </w:t>
+      </w:r>
+      <w:r>
+        <w:rPr>
+          <w:rFonts w:ascii="Times New Roman" w:hAnsi="Times New Roman" w:cs="Times New Roman"/>
+        </w:rPr>
+        <w:t>is historically understudied by ecologists</w:t>
+      </w:r>
+      <w:r>
+        <w:rPr>
+          <w:rFonts w:ascii="Times New Roman" w:hAnsi="Times New Roman" w:cs="Times New Roman"/>
+        </w:rPr>
+        <w:t>, who have typically</w:t>
+      </w:r>
+      <w:r>
+        <w:rPr>
+          <w:rFonts w:ascii="Times New Roman" w:hAnsi="Times New Roman" w:cs="Times New Roman"/>
+        </w:rPr>
+        <w:t xml:space="preserve"> focused on trait means </w:t>
+      </w:r>
+      <w:r>
+        <w:rPr>
+          <w:rFonts w:ascii="Times New Roman" w:hAnsi="Times New Roman" w:cs="Times New Roman"/>
+        </w:rPr>
+        <w:t>instead</w:t>
+      </w:r>
+      <w:r>
+        <w:rPr>
+          <w:rFonts w:ascii="Times New Roman" w:hAnsi="Times New Roman" w:cs="Times New Roman"/>
+        </w:rPr>
+        <w:t xml:space="preserve">. Not only does standing genetic variation have implications for interactions among species, </w:t>
+      </w:r>
+      <w:r>
+        <w:rPr>
+          <w:rFonts w:ascii="Times New Roman" w:hAnsi="Times New Roman" w:cs="Times New Roman"/>
+        </w:rPr>
+        <w:t>but it</w:t>
+      </w:r>
+      <w:r>
+        <w:rPr>
+          <w:rFonts w:ascii="Times New Roman" w:hAnsi="Times New Roman" w:cs="Times New Roman"/>
+        </w:rPr>
+        <w:t xml:space="preserve"> </w:t>
+      </w:r>
+      <w:r>
+        <w:rPr>
+          <w:rFonts w:ascii="Times New Roman" w:hAnsi="Times New Roman" w:cs="Times New Roman"/>
+        </w:rPr>
+        <w:t xml:space="preserve">is </w:t>
+      </w:r>
+      <w:r>
+        <w:rPr>
+          <w:rFonts w:ascii="Times New Roman" w:hAnsi="Times New Roman" w:cs="Times New Roman"/>
+        </w:rPr>
+        <w:t xml:space="preserve">also a key determinant of adaptive potential. </w:t>
+      </w:r>
+      <w:r>
+        <w:rPr>
+          <w:rFonts w:ascii="Times New Roman" w:hAnsi="Times New Roman" w:cs="Times New Roman"/>
+        </w:rPr>
+        <w:t>Regardless of selection strength, heritability, and generation time, selection cannot lead to rapid adaptation to a new climate w</w:t>
+      </w:r>
+      <w:r>
+        <w:rPr>
+          <w:rFonts w:ascii="Times New Roman" w:hAnsi="Times New Roman" w:cs="Times New Roman"/>
+        </w:rPr>
+        <w:t>ithout sufficient variation.</w:t>
+      </w:r>
+      <w:r>
+        <w:rPr>
+          <w:rFonts w:ascii="Times New Roman" w:hAnsi="Times New Roman" w:cs="Times New Roman"/>
+        </w:rPr>
+        <w:t xml:space="preserve"> This</w:t>
+      </w:r>
+      <w:r>
+        <w:rPr>
+          <w:rFonts w:ascii="Times New Roman" w:hAnsi="Times New Roman" w:cs="Times New Roman"/>
+        </w:rPr>
+        <w:t xml:space="preserve"> variation</w:t>
+      </w:r>
+      <w:r>
+        <w:rPr>
+          <w:rFonts w:ascii="Times New Roman" w:hAnsi="Times New Roman" w:cs="Times New Roman"/>
+        </w:rPr>
+        <w:t xml:space="preserve"> is critical for </w:t>
+      </w:r>
+      <w:r>
+        <w:rPr>
+          <w:rFonts w:ascii="Times New Roman" w:hAnsi="Times New Roman" w:cs="Times New Roman"/>
+        </w:rPr>
+        <w:t xml:space="preserve">the </w:t>
+      </w:r>
+      <w:r>
+        <w:rPr>
+          <w:rFonts w:ascii="Times New Roman" w:hAnsi="Times New Roman" w:cs="Times New Roman"/>
+        </w:rPr>
+        <w:t>persistence</w:t>
+      </w:r>
+      <w:r>
+        <w:rPr>
+          <w:rFonts w:ascii="Times New Roman" w:hAnsi="Times New Roman" w:cs="Times New Roman"/>
+        </w:rPr>
+        <w:t xml:space="preserve"> of populations that must evolve quickly to escape extinction. </w:t>
+      </w:r>
+    </w:p>
+    <w:p>
+      <w:pPr>
+        <w:spacing w:after="0" w:line="240" w:lineRule="auto"/>
+        <w:rPr>
+          <w:rFonts w:ascii="Times New Roman" w:hAnsi="Times New Roman" w:cs="Times New Roman"/>
+        </w:rPr>
+      </w:pPr>
+    </w:p>
+    <w:p>
+      <w:pPr>
+        <w:spacing w:after="0" w:line="240" w:lineRule="auto"/>
+        <w:rPr>
+          <w:rFonts w:ascii="Times New Roman" w:hAnsi="Times New Roman" w:cs="Times New Roman"/>
+        </w:rPr>
+      </w:pPr>
+      <w:r>
+        <w:rPr>
+          <w:rFonts w:ascii="Times New Roman" w:hAnsi="Times New Roman" w:cs="Times New Roman"/>
+        </w:rPr>
+        <w:t xml:space="preserve">Variation in traits that mediate responses to temperature is particularly important, because temperature is one of the primary axes along which climate change is occurring. </w:t>
+      </w:r>
+      <w:r>
+        <w:rPr>
+          <w:rFonts w:ascii="Times New Roman" w:hAnsi="Times New Roman" w:cs="Times New Roman"/>
+        </w:rPr>
+        <w:t>Temperature affects a broad range of ecologically relevant traits, including growth rate, body size, and reproduction</w:t>
+      </w:r>
+      <w:r>
+        <w:rPr>
+          <w:rFonts w:ascii="Times New Roman" w:hAnsi="Times New Roman" w:cs="Times New Roman"/>
+        </w:rPr>
+        <w:t xml:space="preserve"> (Angilletta 2009)</w:t>
+      </w:r>
+      <w:r>
+        <w:rPr>
+          <w:rFonts w:ascii="Times New Roman" w:hAnsi="Times New Roman" w:cs="Times New Roman"/>
+        </w:rPr>
+        <w:t>. As a result, variation in these traits can affect individual performance</w:t>
+      </w:r>
+      <w:r>
+        <w:rPr>
+          <w:rFonts w:ascii="Times New Roman" w:hAnsi="Times New Roman" w:cs="Times New Roman"/>
+        </w:rPr>
+        <w:t xml:space="preserve"> and fitness</w:t>
+      </w:r>
+      <w:r>
+        <w:rPr>
+          <w:rFonts w:ascii="Times New Roman" w:hAnsi="Times New Roman" w:cs="Times New Roman"/>
+        </w:rPr>
+        <w:t xml:space="preserve"> (</w:t>
+      </w:r>
+      <w:r>
+        <w:rPr>
+          <w:rFonts w:ascii="Times New Roman" w:hAnsi="Times New Roman" w:cs="Times New Roman"/>
+        </w:rPr>
+        <w:t>Kingsolver and Buckley 2017</w:t>
+      </w:r>
+      <w:r>
+        <w:rPr>
+          <w:rFonts w:ascii="Times New Roman" w:hAnsi="Times New Roman" w:cs="Times New Roman"/>
+        </w:rPr>
+        <w:t>)</w:t>
+      </w:r>
+      <w:r>
+        <w:rPr>
+          <w:rFonts w:ascii="Times New Roman" w:hAnsi="Times New Roman" w:cs="Times New Roman"/>
+        </w:rPr>
+        <w:t>. Individuals differ not only in trait values, but also in how they respond to temperature</w:t>
+      </w:r>
+      <w:r>
+        <w:rPr>
+          <w:rFonts w:ascii="Times New Roman" w:hAnsi="Times New Roman" w:cs="Times New Roman"/>
+        </w:rPr>
+        <w:t>.</w:t>
+      </w:r>
+      <w:r>
+        <w:rPr>
+          <w:rFonts w:ascii="Times New Roman" w:hAnsi="Times New Roman" w:cs="Times New Roman"/>
+        </w:rPr>
+        <w:t xml:space="preserve"> </w:t>
+      </w:r>
+      <w:r>
+        <w:rPr>
+          <w:rFonts w:ascii="Times New Roman" w:hAnsi="Times New Roman" w:cs="Times New Roman"/>
+        </w:rPr>
+        <w:t>T</w:t>
+      </w:r>
+      <w:r>
+        <w:rPr>
+          <w:rFonts w:ascii="Times New Roman" w:hAnsi="Times New Roman" w:cs="Times New Roman"/>
+        </w:rPr>
+        <w:t xml:space="preserve">hese differences in response to temperature </w:t>
+      </w:r>
+      <w:r>
+        <w:rPr>
+          <w:rFonts w:ascii="Times New Roman" w:hAnsi="Times New Roman" w:cs="Times New Roman"/>
+        </w:rPr>
+        <w:t xml:space="preserve">can represent an additional dimension of variation that may contribute to adaptive potential under </w:t>
+      </w:r>
+      <w:r>
+        <w:rPr>
+          <w:rFonts w:ascii="Times New Roman" w:hAnsi="Times New Roman" w:cs="Times New Roman"/>
+        </w:rPr>
+        <w:t>climate change.</w:t>
+      </w:r>
+      <w:r>
+        <w:rPr>
+          <w:rFonts w:ascii="Times New Roman" w:hAnsi="Times New Roman" w:cs="Times New Roman"/>
+        </w:rPr>
+        <w:t xml:space="preserve"> </w:t>
+      </w:r>
+      <w:r>
+        <w:rPr>
+          <w:rFonts w:ascii="Times New Roman" w:hAnsi="Times New Roman" w:cs="Times New Roman"/>
+        </w:rPr>
+        <w:t xml:space="preserve">However, the effect of this variation is not only determined by how much exists within a population as a whole, but also </w:t>
+      </w:r>
+      <w:r>
+        <w:rPr>
+          <w:rFonts w:ascii="Times New Roman" w:hAnsi="Times New Roman" w:cs="Times New Roman"/>
+        </w:rPr>
+        <w:t xml:space="preserve">where in that population the variation </w:t>
+      </w:r>
+      <w:r>
+        <w:rPr>
+          <w:rFonts w:ascii="Times New Roman" w:hAnsi="Times New Roman" w:cs="Times New Roman"/>
+        </w:rPr>
+        <w:t>resides</w:t>
+      </w:r>
+      <w:r>
+        <w:rPr>
+          <w:rFonts w:ascii="Times New Roman" w:hAnsi="Times New Roman" w:cs="Times New Roman"/>
+        </w:rPr>
+        <w:t>.</w:t>
+      </w:r>
+    </w:p>
+    <w:p>
+      <w:pPr>
+        <w:spacing w:after="0" w:line="240" w:lineRule="auto"/>
+        <w:rPr>
+          <w:rFonts w:ascii="Times New Roman" w:hAnsi="Times New Roman" w:cs="Times New Roman"/>
+        </w:rPr>
+      </w:pPr>
+    </w:p>
+    <w:p>
+      <w:pPr>
+        <w:spacing w:after="0" w:line="240" w:lineRule="auto"/>
+        <w:rPr>
+          <w:rFonts w:ascii="Times New Roman" w:hAnsi="Times New Roman" w:cs="Times New Roman"/>
+        </w:rPr>
+      </w:pPr>
+      <w:r>
+        <w:rPr>
+          <w:rFonts w:ascii="Times New Roman" w:hAnsi="Times New Roman" w:cs="Times New Roman"/>
+        </w:rPr>
+        <w:t>The s</w:t>
+      </w:r>
+      <w:r>
+        <w:rPr>
+          <w:rFonts w:ascii="Times New Roman" w:hAnsi="Times New Roman" w:cs="Times New Roman"/>
+        </w:rPr>
+        <w:t xml:space="preserve">tanding genetic variation </w:t>
+      </w:r>
+      <w:r>
+        <w:rPr>
+          <w:rFonts w:ascii="Times New Roman" w:hAnsi="Times New Roman" w:cs="Times New Roman"/>
+        </w:rPr>
+        <w:t xml:space="preserve">of a population </w:t>
+      </w:r>
+      <w:r>
+        <w:rPr>
+          <w:rFonts w:ascii="Times New Roman" w:hAnsi="Times New Roman" w:cs="Times New Roman"/>
+        </w:rPr>
+        <w:t xml:space="preserve">should not be </w:t>
+      </w:r>
+      <w:r>
+        <w:rPr>
+          <w:rFonts w:ascii="Times New Roman" w:hAnsi="Times New Roman" w:cs="Times New Roman"/>
+        </w:rPr>
+        <w:t>treated as a homogenous pool,</w:t>
+      </w:r>
+      <w:r>
+        <w:rPr>
+          <w:rFonts w:ascii="Times New Roman" w:hAnsi="Times New Roman" w:cs="Times New Roman"/>
+        </w:rPr>
+        <w:t xml:space="preserve"> because there is </w:t>
+      </w:r>
+      <w:r>
+        <w:rPr>
+          <w:rFonts w:ascii="Times New Roman" w:hAnsi="Times New Roman" w:cs="Times New Roman"/>
+        </w:rPr>
+        <w:t>potential for structural variation across multiple spatial scales</w:t>
+      </w:r>
+      <w:r>
+        <w:rPr>
+          <w:rFonts w:ascii="Times New Roman" w:hAnsi="Times New Roman" w:cs="Times New Roman"/>
+        </w:rPr>
+        <w:t xml:space="preserve"> (Bolni</w:t>
+      </w:r>
+      <w:r>
+        <w:rPr>
+          <w:rFonts w:ascii="Times New Roman" w:hAnsi="Times New Roman" w:cs="Times New Roman"/>
+        </w:rPr>
+        <w:t>c</w:t>
+      </w:r>
+      <w:r>
+        <w:rPr>
+          <w:rFonts w:ascii="Times New Roman" w:hAnsi="Times New Roman" w:cs="Times New Roman"/>
+        </w:rPr>
+        <w:t xml:space="preserve">k et al. 2011; </w:t>
+      </w:r>
+      <w:proofErr w:type="spellStart"/>
+      <w:r>
+        <w:rPr>
+          <w:rFonts w:ascii="Times New Roman" w:hAnsi="Times New Roman" w:cs="Times New Roman"/>
+        </w:rPr>
+        <w:t>Violle</w:t>
+      </w:r>
+      <w:proofErr w:type="spellEnd"/>
+      <w:r>
+        <w:rPr>
+          <w:rFonts w:ascii="Times New Roman" w:hAnsi="Times New Roman" w:cs="Times New Roman"/>
+        </w:rPr>
+        <w:t xml:space="preserve"> et al. 2012)</w:t>
+      </w:r>
+      <w:r>
+        <w:rPr>
+          <w:rFonts w:ascii="Times New Roman" w:hAnsi="Times New Roman" w:cs="Times New Roman"/>
+        </w:rPr>
+        <w:t>.</w:t>
+      </w:r>
+      <w:r>
+        <w:rPr>
+          <w:rFonts w:ascii="Times New Roman" w:hAnsi="Times New Roman" w:cs="Times New Roman"/>
+        </w:rPr>
+        <w:t xml:space="preserve"> </w:t>
+      </w:r>
+      <w:r>
+        <w:rPr>
+          <w:rFonts w:ascii="Times New Roman" w:hAnsi="Times New Roman" w:cs="Times New Roman"/>
+        </w:rPr>
+        <w:t xml:space="preserve">Previous work investigating the spatial scale of </w:t>
+      </w:r>
+      <w:r>
+        <w:rPr>
+          <w:rFonts w:ascii="Times New Roman" w:hAnsi="Times New Roman" w:cs="Times New Roman"/>
+        </w:rPr>
+        <w:t xml:space="preserve">intraspecific </w:t>
+      </w:r>
+      <w:r>
+        <w:rPr>
+          <w:rFonts w:ascii="Times New Roman" w:hAnsi="Times New Roman" w:cs="Times New Roman"/>
+        </w:rPr>
+        <w:t>variation has shown variation is often spread across multiple hierarchical levels, including within individuals as plastic responses, among individuals within populations, and among populations</w:t>
+      </w:r>
+      <w:r>
+        <w:rPr>
+          <w:rFonts w:ascii="Times New Roman" w:hAnsi="Times New Roman" w:cs="Times New Roman"/>
+        </w:rPr>
+        <w:t xml:space="preserve"> (Albert et al. 2011</w:t>
+      </w:r>
+      <w:r>
+        <w:rPr>
+          <w:rFonts w:ascii="Times New Roman" w:hAnsi="Times New Roman" w:cs="Times New Roman"/>
+        </w:rPr>
+        <w:t>; Messier et al. 2010</w:t>
+      </w:r>
+      <w:r>
+        <w:rPr>
+          <w:rFonts w:ascii="Times New Roman" w:hAnsi="Times New Roman" w:cs="Times New Roman"/>
+        </w:rPr>
+        <w:t>)</w:t>
+      </w:r>
+      <w:r>
+        <w:rPr>
+          <w:rFonts w:ascii="Times New Roman" w:hAnsi="Times New Roman" w:cs="Times New Roman"/>
+        </w:rPr>
+        <w:t xml:space="preserve">. </w:t>
+      </w:r>
+      <w:r>
+        <w:rPr>
+          <w:rFonts w:ascii="Times New Roman" w:hAnsi="Times New Roman" w:cs="Times New Roman"/>
+        </w:rPr>
+        <w:t>T</w:t>
+      </w:r>
+      <w:r>
+        <w:rPr>
+          <w:rFonts w:ascii="Times New Roman" w:hAnsi="Times New Roman" w:cs="Times New Roman"/>
+        </w:rPr>
+        <w:t xml:space="preserve">he structure of </w:t>
+      </w:r>
+      <w:r>
+        <w:rPr>
+          <w:rFonts w:ascii="Times New Roman" w:hAnsi="Times New Roman" w:cs="Times New Roman"/>
+        </w:rPr>
+        <w:t xml:space="preserve">variation in temperature response within a population </w:t>
+      </w:r>
+      <w:r>
+        <w:rPr>
+          <w:rFonts w:ascii="Times New Roman" w:hAnsi="Times New Roman" w:cs="Times New Roman"/>
+        </w:rPr>
+        <w:t xml:space="preserve">can </w:t>
+      </w:r>
+      <w:r>
+        <w:rPr>
+          <w:rFonts w:ascii="Times New Roman" w:hAnsi="Times New Roman" w:cs="Times New Roman"/>
+        </w:rPr>
+        <w:t>influence adaptive potential</w:t>
+      </w:r>
+      <w:r>
+        <w:rPr>
+          <w:rFonts w:ascii="Times New Roman" w:hAnsi="Times New Roman" w:cs="Times New Roman"/>
+        </w:rPr>
+        <w:t xml:space="preserve">, </w:t>
+      </w:r>
+      <w:r>
+        <w:rPr>
+          <w:rFonts w:ascii="Times New Roman" w:hAnsi="Times New Roman" w:cs="Times New Roman"/>
+        </w:rPr>
+        <w:t>since</w:t>
+      </w:r>
+      <w:r>
+        <w:rPr>
+          <w:rFonts w:ascii="Times New Roman" w:hAnsi="Times New Roman" w:cs="Times New Roman"/>
+        </w:rPr>
+        <w:t xml:space="preserve"> </w:t>
+      </w:r>
+      <w:r>
+        <w:rPr>
+          <w:rFonts w:ascii="Times New Roman" w:hAnsi="Times New Roman" w:cs="Times New Roman"/>
+        </w:rPr>
+        <w:t xml:space="preserve">the spatial </w:t>
+      </w:r>
+      <w:r>
+        <w:rPr>
+          <w:rFonts w:ascii="Times New Roman" w:hAnsi="Times New Roman" w:cs="Times New Roman"/>
+        </w:rPr>
+        <w:t xml:space="preserve">scale </w:t>
+      </w:r>
+      <w:r>
+        <w:rPr>
+          <w:rFonts w:ascii="Times New Roman" w:hAnsi="Times New Roman" w:cs="Times New Roman"/>
+        </w:rPr>
+        <w:t xml:space="preserve">of variation </w:t>
+      </w:r>
+      <w:r>
+        <w:rPr>
+          <w:rFonts w:ascii="Times New Roman" w:hAnsi="Times New Roman" w:cs="Times New Roman"/>
+        </w:rPr>
+        <w:t>can shape</w:t>
+      </w:r>
+      <w:r>
+        <w:rPr>
+          <w:rFonts w:ascii="Times New Roman" w:hAnsi="Times New Roman" w:cs="Times New Roman"/>
+        </w:rPr>
+        <w:t xml:space="preserve"> </w:t>
+      </w:r>
+      <w:r>
+        <w:rPr>
+          <w:rFonts w:ascii="Times New Roman" w:hAnsi="Times New Roman" w:cs="Times New Roman"/>
+        </w:rPr>
+        <w:t xml:space="preserve">how effectively selection can drive rapid adaptation to environmental change </w:t>
+      </w:r>
+      <w:r>
+        <w:rPr>
+          <w:rFonts w:ascii="Times New Roman" w:hAnsi="Times New Roman" w:cs="Times New Roman"/>
+        </w:rPr>
+        <w:t>(</w:t>
+      </w:r>
+      <w:r>
+        <w:rPr>
+          <w:rFonts w:ascii="Times New Roman" w:hAnsi="Times New Roman" w:cs="Times New Roman"/>
+        </w:rPr>
+        <w:t>Baumann and Conover</w:t>
+      </w:r>
+      <w:r>
+        <w:rPr>
+          <w:rFonts w:ascii="Times New Roman" w:hAnsi="Times New Roman" w:cs="Times New Roman"/>
+        </w:rPr>
+        <w:t xml:space="preserve"> 2011</w:t>
+      </w:r>
+      <w:r>
+        <w:rPr>
+          <w:rFonts w:ascii="Times New Roman" w:hAnsi="Times New Roman" w:cs="Times New Roman"/>
+        </w:rPr>
+        <w:t xml:space="preserve">; </w:t>
+      </w:r>
+      <w:r>
+        <w:rPr>
+          <w:rFonts w:ascii="Times New Roman" w:hAnsi="Times New Roman" w:cs="Times New Roman"/>
+        </w:rPr>
+        <w:t xml:space="preserve">Buckley and </w:t>
+      </w:r>
+      <w:r>
+        <w:rPr>
+          <w:rFonts w:ascii="Times New Roman" w:hAnsi="Times New Roman" w:cs="Times New Roman"/>
+        </w:rPr>
+        <w:t>Kingsolver 20</w:t>
+      </w:r>
+      <w:r>
+        <w:rPr>
+          <w:rFonts w:ascii="Times New Roman" w:hAnsi="Times New Roman" w:cs="Times New Roman"/>
+        </w:rPr>
+        <w:t>21</w:t>
+      </w:r>
+      <w:r>
+        <w:rPr>
+          <w:rFonts w:ascii="Times New Roman" w:hAnsi="Times New Roman" w:cs="Times New Roman"/>
+        </w:rPr>
+        <w:t>)</w:t>
+      </w:r>
+      <w:r>
+        <w:rPr>
+          <w:rFonts w:ascii="Times New Roman" w:hAnsi="Times New Roman" w:cs="Times New Roman"/>
+        </w:rPr>
+        <w:t>.</w:t>
+      </w:r>
+      <w:r>
+        <w:rPr>
+          <w:rFonts w:ascii="Times New Roman" w:hAnsi="Times New Roman" w:cs="Times New Roman"/>
+        </w:rPr>
+        <w:t xml:space="preserve"> In populations with complex spatial hierarchies, it can be difficult to assess adaptive potential without first investigating how variance is partitioned among spatial scales.</w:t>
+      </w:r>
+      <w:r>
+        <w:rPr>
+          <w:rFonts w:ascii="Times New Roman" w:hAnsi="Times New Roman" w:cs="Times New Roman"/>
+        </w:rPr>
+        <w:t xml:space="preserve"> </w:t>
+      </w:r>
+    </w:p>
+    <w:p>
+      <w:pPr>
+        <w:spacing w:after="0" w:line="240" w:lineRule="auto"/>
+        <w:rPr>
+          <w:rFonts w:ascii="Times New Roman" w:hAnsi="Times New Roman" w:cs="Times New Roman"/>
+        </w:rPr>
+      </w:pPr>
     </w:p>
     <w:p>
       <w:pPr>
         <w:pStyle w:val="ListParagraph"/>
         <w:numPr>
           <w:ilvl w:val="0"/>
-          <w:numId w:val="9"/>
+          <w:numId w:val="13"/>
         </w:numPr>
         <w:spacing w:after="0" w:line="240" w:lineRule="auto"/>
         <w:rPr>
@@ -872,7 +1382,7 @@
         <w:rPr>
           <w:rFonts w:ascii="Times New Roman" w:hAnsi="Times New Roman" w:cs="Times New Roman"/>
         </w:rPr>
-        <w:t>Historically, ecology focused on population means</w:t>
+        <w:t>Most studies partition variance as trait values</w:t>
       </w:r>
     </w:p>
     <w:p>
@@ -880,7 +1390,7 @@
         <w:pStyle w:val="ListParagraph"/>
         <w:numPr>
           <w:ilvl w:val="0"/>
-          <w:numId w:val="9"/>
+          <w:numId w:val="13"/>
         </w:numPr>
         <w:spacing w:after="0" w:line="240" w:lineRule="auto"/>
         <w:rPr>
@@ -891,43 +1401,8 @@
         <w:rPr>
           <w:rFonts w:ascii="Times New Roman" w:hAnsi="Times New Roman" w:cs="Times New Roman"/>
         </w:rPr>
-        <w:t xml:space="preserve">Shift towards intraspecific trait variation, which can affect population persistence and community dynamics </w:t>
-      </w:r>
-    </w:p>
-    <w:p>
-      <w:pPr>
-        <w:spacing w:after="0" w:line="240" w:lineRule="auto"/>
-        <w:rPr>
-          <w:rFonts w:ascii="Times New Roman" w:hAnsi="Times New Roman" w:cs="Times New Roman"/>
-        </w:rPr>
-      </w:pPr>
-      <w:r>
-        <w:rPr>
-          <w:rFonts w:ascii="Times New Roman" w:hAnsi="Times New Roman" w:cs="Times New Roman"/>
-        </w:rPr>
-        <w:t>However, ITV is often treated as a single pool — ignoring spatial structure</w:t>
-      </w:r>
-    </w:p>
-    <w:p>
-      <w:pPr>
-        <w:spacing w:after="0" w:line="240" w:lineRule="auto"/>
-        <w:rPr>
-          <w:rFonts w:ascii="Times New Roman" w:hAnsi="Times New Roman" w:cs="Times New Roman"/>
-        </w:rPr>
-      </w:pPr>
-    </w:p>
-    <w:p>
-      <w:pPr>
-        <w:spacing w:after="0" w:line="240" w:lineRule="auto"/>
-        <w:rPr>
-          <w:rFonts w:ascii="Times New Roman" w:hAnsi="Times New Roman" w:cs="Times New Roman"/>
-        </w:rPr>
-      </w:pPr>
-      <w:r>
-        <w:rPr>
-          <w:rFonts w:ascii="Times New Roman" w:hAnsi="Times New Roman" w:cs="Times New Roman"/>
-        </w:rPr>
-        <w:t>Spatial structure of variation</w:t>
+        <w:lastRenderedPageBreak/>
+        <w:t>Misses the potential for response to environment to have the relevant variation</w:t>
       </w:r>
     </w:p>
     <w:p>
@@ -935,7 +1410,7 @@
         <w:pStyle w:val="ListParagraph"/>
         <w:numPr>
           <w:ilvl w:val="0"/>
-          <w:numId w:val="10"/>
+          <w:numId w:val="13"/>
         </w:numPr>
         <w:spacing w:after="0" w:line="240" w:lineRule="auto"/>
         <w:rPr>
@@ -946,7 +1421,7 @@
         <w:rPr>
           <w:rFonts w:ascii="Times New Roman" w:hAnsi="Times New Roman" w:cs="Times New Roman"/>
         </w:rPr>
-        <w:t>Variation can exist at multiple nested scales</w:t>
+        <w:t>Variation in reaction norms is distributed across spatial scales within natural populations is poorly understood</w:t>
       </w:r>
     </w:p>
     <w:p>
@@ -954,145 +1429,29 @@
         <w:pStyle w:val="ListParagraph"/>
         <w:numPr>
           <w:ilvl w:val="0"/>
-          <w:numId w:val="10"/>
+          <w:numId w:val="13"/>
         </w:numPr>
         <w:spacing w:after="0" w:line="240" w:lineRule="auto"/>
         <w:rPr>
           <w:rFonts w:ascii="Times New Roman" w:hAnsi="Times New Roman" w:cs="Times New Roman"/>
         </w:rPr>
       </w:pPr>
-      <w:r>
-        <w:rPr>
-          <w:rFonts w:ascii="Times New Roman" w:hAnsi="Times New Roman" w:cs="Times New Roman"/>
-        </w:rPr>
-        <w:t>Determines the scale at which selection acts, and therefore the potential for rapid evolution</w:t>
-      </w:r>
-    </w:p>
-    <w:p>
-      <w:pPr>
-        <w:pStyle w:val="ListParagraph"/>
-        <w:numPr>
-          <w:ilvl w:val="0"/>
-          <w:numId w:val="10"/>
-        </w:numPr>
-        <w:spacing w:after="0" w:line="240" w:lineRule="auto"/>
-        <w:rPr>
-          <w:rFonts w:ascii="Times New Roman" w:hAnsi="Times New Roman" w:cs="Times New Roman"/>
-        </w:rPr>
-      </w:pPr>
-      <w:r>
-        <w:rPr>
-          <w:rFonts w:ascii="Times New Roman" w:hAnsi="Times New Roman" w:cs="Times New Roman"/>
-        </w:rPr>
-        <w:t>We don’t always know where the biologically meaningful variation resides</w:t>
-      </w:r>
-    </w:p>
-    <w:p>
-      <w:pPr>
-        <w:spacing w:after="0" w:line="240" w:lineRule="auto"/>
-        <w:rPr>
-          <w:rFonts w:ascii="Times New Roman" w:hAnsi="Times New Roman" w:cs="Times New Roman"/>
-        </w:rPr>
-      </w:pPr>
-      <w:r>
-        <w:rPr>
-          <w:rFonts w:ascii="Times New Roman" w:hAnsi="Times New Roman" w:cs="Times New Roman"/>
-        </w:rPr>
-        <w:t>This is especially relevant for function-valued traits</w:t>
-      </w:r>
-    </w:p>
-    <w:p>
-      <w:pPr>
-        <w:spacing w:after="0" w:line="240" w:lineRule="auto"/>
-        <w:rPr>
-          <w:rFonts w:ascii="Times New Roman" w:hAnsi="Times New Roman" w:cs="Times New Roman"/>
-        </w:rPr>
-      </w:pPr>
-    </w:p>
-    <w:p>
-      <w:pPr>
-        <w:spacing w:after="0" w:line="240" w:lineRule="auto"/>
-        <w:rPr>
-          <w:rFonts w:ascii="Times New Roman" w:hAnsi="Times New Roman" w:cs="Times New Roman"/>
-        </w:rPr>
-      </w:pPr>
-      <w:r>
-        <w:rPr>
-          <w:rFonts w:ascii="Times New Roman" w:hAnsi="Times New Roman" w:cs="Times New Roman"/>
-        </w:rPr>
-        <w:t>Function-valued traits</w:t>
-      </w:r>
-    </w:p>
-    <w:p>
-      <w:pPr>
-        <w:pStyle w:val="ListParagraph"/>
-        <w:numPr>
-          <w:ilvl w:val="0"/>
-          <w:numId w:val="11"/>
-        </w:numPr>
-        <w:spacing w:after="0" w:line="240" w:lineRule="auto"/>
-        <w:rPr>
-          <w:rFonts w:ascii="Times New Roman" w:hAnsi="Times New Roman" w:cs="Times New Roman"/>
-        </w:rPr>
-      </w:pPr>
-      <w:r>
-        <w:rPr>
-          <w:rFonts w:ascii="Times New Roman" w:hAnsi="Times New Roman" w:cs="Times New Roman"/>
-        </w:rPr>
-        <w:t>Traits that are expressed across environments</w:t>
-      </w:r>
-    </w:p>
-    <w:p>
-      <w:pPr>
-        <w:pStyle w:val="ListParagraph"/>
-        <w:numPr>
-          <w:ilvl w:val="0"/>
-          <w:numId w:val="11"/>
-        </w:numPr>
-        <w:spacing w:after="0" w:line="240" w:lineRule="auto"/>
-        <w:rPr>
-          <w:rFonts w:ascii="Times New Roman" w:hAnsi="Times New Roman" w:cs="Times New Roman"/>
-        </w:rPr>
-      </w:pPr>
-      <w:r>
-        <w:rPr>
-          <w:rFonts w:ascii="Times New Roman" w:hAnsi="Times New Roman" w:cs="Times New Roman"/>
-        </w:rPr>
-        <w:t>Variation can occur in the trait values themselves, but also in the responses</w:t>
-      </w:r>
-    </w:p>
-    <w:p>
-      <w:pPr>
-        <w:pStyle w:val="ListParagraph"/>
-        <w:numPr>
-          <w:ilvl w:val="0"/>
-          <w:numId w:val="11"/>
-        </w:numPr>
-        <w:spacing w:after="0" w:line="240" w:lineRule="auto"/>
-        <w:rPr>
-          <w:rFonts w:ascii="Times New Roman" w:hAnsi="Times New Roman" w:cs="Times New Roman"/>
-        </w:rPr>
-      </w:pPr>
-      <w:r>
-        <w:rPr>
-          <w:rFonts w:ascii="Times New Roman" w:hAnsi="Times New Roman" w:cs="Times New Roman"/>
-        </w:rPr>
-        <w:t>Adaptation depends on the variation in response, not just trait values themselves</w:t>
-      </w:r>
-    </w:p>
-    <w:p>
-      <w:pPr>
-        <w:spacing w:after="0" w:line="240" w:lineRule="auto"/>
-        <w:rPr>
-          <w:rFonts w:ascii="Times New Roman" w:hAnsi="Times New Roman" w:cs="Times New Roman"/>
-        </w:rPr>
-      </w:pPr>
-      <w:r>
-        <w:rPr>
-          <w:rFonts w:ascii="Times New Roman" w:hAnsi="Times New Roman" w:cs="Times New Roman"/>
-        </w:rPr>
-        <w:t>Need systems where we can partition this variation cleanly</w:t>
-      </w:r>
+    </w:p>
+    <w:p>
+      <w:pPr>
+        <w:spacing w:after="0" w:line="240" w:lineRule="auto"/>
+        <w:rPr>
+          <w:rFonts w:ascii="Times New Roman" w:hAnsi="Times New Roman" w:cs="Times New Roman"/>
+        </w:rPr>
+      </w:pPr>
+    </w:p>
+    <w:p>
+      <w:pPr>
+        <w:spacing w:after="0" w:line="240" w:lineRule="auto"/>
+        <w:rPr>
+          <w:rFonts w:ascii="Times New Roman" w:hAnsi="Times New Roman" w:cs="Times New Roman"/>
+        </w:rPr>
+      </w:pPr>
     </w:p>
     <w:p>
       <w:pPr>
@@ -1241,14 +1600,7 @@
         <w:rPr>
           <w:rFonts w:ascii="Times New Roman" w:hAnsi="Times New Roman" w:cs="Times New Roman"/>
         </w:rPr>
-        <w:t xml:space="preserve"> changing at a rate commensurate with population </w:t>
-      </w:r>
-      <w:r>
-        <w:rPr>
-          <w:rFonts w:ascii="Times New Roman" w:hAnsi="Times New Roman" w:cs="Times New Roman"/>
-        </w:rPr>
-        <w:lastRenderedPageBreak/>
-        <w:t>dynamics</w:t>
+        <w:t xml:space="preserve"> changing at a rate commensurate with population dynamics</w:t>
       </w:r>
       <w:r>
         <w:rPr>
@@ -1374,7 +1726,21 @@
         <w:rPr>
           <w:rFonts w:ascii="Times New Roman" w:hAnsi="Times New Roman" w:cs="Times New Roman"/>
         </w:rPr>
-        <w:t xml:space="preserve"> (Bolnek)</w:t>
+        <w:t xml:space="preserve"> (</w:t>
+      </w:r>
+      <w:proofErr w:type="spellStart"/>
+      <w:r>
+        <w:rPr>
+          <w:rFonts w:ascii="Times New Roman" w:hAnsi="Times New Roman" w:cs="Times New Roman"/>
+        </w:rPr>
+        <w:t>Bolnek</w:t>
+      </w:r>
+      <w:proofErr w:type="spellEnd"/>
+      <w:r>
+        <w:rPr>
+          <w:rFonts w:ascii="Times New Roman" w:hAnsi="Times New Roman" w:cs="Times New Roman"/>
+        </w:rPr>
+        <w:t>)</w:t>
       </w:r>
       <w:r>
         <w:rPr>
@@ -1766,7 +2132,23 @@
           <w:rFonts w:ascii="Times New Roman" w:hAnsi="Times New Roman" w:cs="Times New Roman"/>
           <w:highlight w:val="magenta"/>
         </w:rPr>
-        <w:t>Logan, M.L., Cox, R.M., and Calsbeek,</w:t>
+        <w:t xml:space="preserve">Logan, M.L., Cox, R.M., and </w:t>
+      </w:r>
+      <w:proofErr w:type="spellStart"/>
+      <w:r>
+        <w:rPr>
+          <w:rFonts w:ascii="Times New Roman" w:hAnsi="Times New Roman" w:cs="Times New Roman"/>
+          <w:highlight w:val="magenta"/>
+        </w:rPr>
+        <w:t>Calsbeek</w:t>
+      </w:r>
+      <w:proofErr w:type="spellEnd"/>
+      <w:r>
+        <w:rPr>
+          <w:rFonts w:ascii="Times New Roman" w:hAnsi="Times New Roman" w:cs="Times New Roman"/>
+          <w:highlight w:val="magenta"/>
+        </w:rPr>
+        <w:t>,</w:t>
       </w:r>
       <w:r>
         <w:rPr>
@@ -2025,7 +2407,14 @@
         <w:rPr>
           <w:rFonts w:ascii="Times New Roman" w:hAnsi="Times New Roman" w:cs="Times New Roman"/>
         </w:rPr>
-        <w:t>Talks about CT</w:t>
+        <w:t xml:space="preserve">Talks about </w:t>
+      </w:r>
+      <w:proofErr w:type="spellStart"/>
+      <w:r>
+        <w:rPr>
+          <w:rFonts w:ascii="Times New Roman" w:hAnsi="Times New Roman" w:cs="Times New Roman"/>
+        </w:rPr>
+        <w:t>CT</w:t>
       </w:r>
       <w:r>
         <w:rPr>
@@ -2034,6 +2423,7 @@
         </w:rPr>
         <w:t>max</w:t>
       </w:r>
+      <w:proofErr w:type="spellEnd"/>
       <w:r>
         <w:rPr>
           <w:rFonts w:ascii="Times New Roman" w:hAnsi="Times New Roman" w:cs="Times New Roman"/>
@@ -2098,8 +2488,16 @@
         <w:rPr>
           <w:rFonts w:ascii="Times New Roman" w:hAnsi="Times New Roman" w:cs="Times New Roman"/>
         </w:rPr>
-        <w:t>S. Salinas, S.E. Irvine, C.L. Schertzing</w:t>
-      </w:r>
+        <w:t xml:space="preserve">S. Salinas, S.E. Irvine, C.L. </w:t>
+      </w:r>
+      <w:proofErr w:type="spellStart"/>
+      <w:r>
+        <w:rPr>
+          <w:rFonts w:ascii="Times New Roman" w:hAnsi="Times New Roman" w:cs="Times New Roman"/>
+        </w:rPr>
+        <w:t>Schertzing</w:t>
+      </w:r>
+      <w:proofErr w:type="spellEnd"/>
       <w:r>
         <w:rPr>
           <w:rFonts w:ascii="Times New Roman" w:hAnsi="Times New Roman" w:cs="Times New Roman"/>
@@ -2183,7 +2581,23 @@
           <w:rFonts w:ascii="Times New Roman" w:hAnsi="Times New Roman" w:cs="Times New Roman"/>
           <w:highlight w:val="magenta"/>
         </w:rPr>
-        <w:t>Arnold, P.A., Nicotra, A.B., and Kruuk, L.E.B. (2019).</w:t>
+        <w:t xml:space="preserve">Arnold, P.A., Nicotra, A.B., and </w:t>
+      </w:r>
+      <w:proofErr w:type="spellStart"/>
+      <w:r>
+        <w:rPr>
+          <w:rFonts w:ascii="Times New Roman" w:hAnsi="Times New Roman" w:cs="Times New Roman"/>
+          <w:highlight w:val="magenta"/>
+        </w:rPr>
+        <w:t>Kruuk</w:t>
+      </w:r>
+      <w:proofErr w:type="spellEnd"/>
+      <w:r>
+        <w:rPr>
+          <w:rFonts w:ascii="Times New Roman" w:hAnsi="Times New Roman" w:cs="Times New Roman"/>
+          <w:highlight w:val="magenta"/>
+        </w:rPr>
+        <w:t>, L.E.B. (2019).</w:t>
       </w:r>
       <w:r>
         <w:rPr>
@@ -2234,7 +2648,21 @@
         <w:rPr>
           <w:rFonts w:ascii="Times New Roman" w:hAnsi="Times New Roman" w:cs="Times New Roman"/>
         </w:rPr>
-        <w:t xml:space="preserve"> Environ. Microbiol.</w:t>
+        <w:t xml:space="preserve"> Environ. </w:t>
+      </w:r>
+      <w:proofErr w:type="spellStart"/>
+      <w:r>
+        <w:rPr>
+          <w:rFonts w:ascii="Times New Roman" w:hAnsi="Times New Roman" w:cs="Times New Roman"/>
+        </w:rPr>
+        <w:t>Microbiol</w:t>
+      </w:r>
+      <w:proofErr w:type="spellEnd"/>
+      <w:r>
+        <w:rPr>
+          <w:rFonts w:ascii="Times New Roman" w:hAnsi="Times New Roman" w:cs="Times New Roman"/>
+        </w:rPr>
+        <w:t>.</w:t>
       </w:r>
       <w:r>
         <w:rPr>
@@ -2246,7 +2674,35 @@
         <w:rPr>
           <w:rFonts w:ascii="Times New Roman" w:hAnsi="Times New Roman" w:cs="Times New Roman"/>
         </w:rPr>
-        <w:t>K. Rengefors, R. Logares, J. Laybourn-Parry</w:t>
+        <w:t xml:space="preserve">K. </w:t>
+      </w:r>
+      <w:proofErr w:type="spellStart"/>
+      <w:r>
+        <w:rPr>
+          <w:rFonts w:ascii="Times New Roman" w:hAnsi="Times New Roman" w:cs="Times New Roman"/>
+        </w:rPr>
+        <w:t>Rengefors</w:t>
+      </w:r>
+      <w:proofErr w:type="spellEnd"/>
+      <w:r>
+        <w:rPr>
+          <w:rFonts w:ascii="Times New Roman" w:hAnsi="Times New Roman" w:cs="Times New Roman"/>
+        </w:rPr>
+        <w:t xml:space="preserve">, R. </w:t>
+      </w:r>
+      <w:proofErr w:type="spellStart"/>
+      <w:r>
+        <w:rPr>
+          <w:rFonts w:ascii="Times New Roman" w:hAnsi="Times New Roman" w:cs="Times New Roman"/>
+        </w:rPr>
+        <w:t>Logares</w:t>
+      </w:r>
+      <w:proofErr w:type="spellEnd"/>
+      <w:r>
+        <w:rPr>
+          <w:rFonts w:ascii="Times New Roman" w:hAnsi="Times New Roman" w:cs="Times New Roman"/>
+        </w:rPr>
+        <w:t>, J. Laybourn-Parry</w:t>
       </w:r>
       <w:r>
         <w:rPr>
@@ -2778,13 +3234,41 @@
         </w:rPr>
         <w:t xml:space="preserve">Thompson, J.N. 1998. Rapid evolution as an ecological process. </w:t>
       </w:r>
+      <w:proofErr w:type="spellStart"/>
       <w:r>
         <w:rPr>
           <w:rFonts w:ascii="Times New Roman" w:hAnsi="Times New Roman" w:cs="Times New Roman"/>
           <w:i/>
           <w:iCs/>
         </w:rPr>
-        <w:t>Treds Ecol Evol.</w:t>
+        <w:t>Treds</w:t>
+      </w:r>
+      <w:proofErr w:type="spellEnd"/>
+      <w:r>
+        <w:rPr>
+          <w:rFonts w:ascii="Times New Roman" w:hAnsi="Times New Roman" w:cs="Times New Roman"/>
+          <w:i/>
+          <w:iCs/>
+        </w:rPr>
+        <w:t xml:space="preserve"> </w:t>
+      </w:r>
+      <w:proofErr w:type="spellStart"/>
+      <w:r>
+        <w:rPr>
+          <w:rFonts w:ascii="Times New Roman" w:hAnsi="Times New Roman" w:cs="Times New Roman"/>
+          <w:i/>
+          <w:iCs/>
+        </w:rPr>
+        <w:t>Ecol</w:t>
+      </w:r>
+      <w:proofErr w:type="spellEnd"/>
+      <w:r>
+        <w:rPr>
+          <w:rFonts w:ascii="Times New Roman" w:hAnsi="Times New Roman" w:cs="Times New Roman"/>
+          <w:i/>
+          <w:iCs/>
+        </w:rPr>
+        <w:t xml:space="preserve"> Evol.</w:t>
       </w:r>
       <w:r>
         <w:rPr>
@@ -2811,13 +3295,23 @@
         </w:rPr>
         <w:t xml:space="preserve">Hairston, N.G. 2005. Rapid evolution and the convergence of ecological and evolutionary time. </w:t>
       </w:r>
+      <w:proofErr w:type="spellStart"/>
       <w:r>
         <w:rPr>
           <w:rFonts w:ascii="Times New Roman" w:hAnsi="Times New Roman" w:cs="Times New Roman"/>
           <w:i/>
           <w:iCs/>
         </w:rPr>
-        <w:t>Ecol Lett.</w:t>
+        <w:t>Ecol</w:t>
+      </w:r>
+      <w:proofErr w:type="spellEnd"/>
+      <w:r>
+        <w:rPr>
+          <w:rFonts w:ascii="Times New Roman" w:hAnsi="Times New Roman" w:cs="Times New Roman"/>
+          <w:i/>
+          <w:iCs/>
+        </w:rPr>
+        <w:t xml:space="preserve"> Lett.</w:t>
       </w:r>
       <w:r>
         <w:rPr>
@@ -2917,13 +3411,23 @@
         <w:lastRenderedPageBreak/>
         <w:t xml:space="preserve">Pelletier, F. 2009. Eco-evolutionary dynamics. </w:t>
       </w:r>
+      <w:proofErr w:type="spellStart"/>
       <w:r>
         <w:rPr>
           <w:rFonts w:ascii="Times New Roman" w:hAnsi="Times New Roman" w:cs="Times New Roman"/>
           <w:i/>
           <w:iCs/>
         </w:rPr>
-        <w:t>Philos Trans R Soc B: Biol Sci.</w:t>
+        <w:t>Philos</w:t>
+      </w:r>
+      <w:proofErr w:type="spellEnd"/>
+      <w:r>
+        <w:rPr>
+          <w:rFonts w:ascii="Times New Roman" w:hAnsi="Times New Roman" w:cs="Times New Roman"/>
+          <w:i/>
+          <w:iCs/>
+        </w:rPr>
+        <w:t xml:space="preserve"> Trans R Soc B: Biol Sci.</w:t>
       </w:r>
       <w:r>
         <w:rPr>
@@ -3015,13 +3519,23 @@
         </w:rPr>
         <w:t xml:space="preserve"> </w:t>
       </w:r>
+      <w:proofErr w:type="spellStart"/>
       <w:r>
         <w:rPr>
           <w:rFonts w:ascii="Times New Roman" w:hAnsi="Times New Roman" w:cs="Times New Roman"/>
           <w:i/>
           <w:iCs/>
         </w:rPr>
-        <w:t>Philos Trans R Soc B: Biol Sci.</w:t>
+        <w:t>Philos</w:t>
+      </w:r>
+      <w:proofErr w:type="spellEnd"/>
+      <w:r>
+        <w:rPr>
+          <w:rFonts w:ascii="Times New Roman" w:hAnsi="Times New Roman" w:cs="Times New Roman"/>
+          <w:i/>
+          <w:iCs/>
+        </w:rPr>
+        <w:t xml:space="preserve"> Trans R Soc B: Biol Sci.</w:t>
       </w:r>
       <w:r>
         <w:rPr>
@@ -3206,7 +3720,23 @@
           <w:rFonts w:ascii="Times New Roman" w:hAnsi="Times New Roman" w:cs="Times New Roman"/>
           <w:highlight w:val="magenta"/>
         </w:rPr>
-        <w:t>Conover D.O. 1995. Phenotypic similarity and the evolutionary significance of countergradient variation.</w:t>
+        <w:t xml:space="preserve">Conover D.O. 1995. Phenotypic similarity and the evolutionary significance of </w:t>
+      </w:r>
+      <w:proofErr w:type="spellStart"/>
+      <w:r>
+        <w:rPr>
+          <w:rFonts w:ascii="Times New Roman" w:hAnsi="Times New Roman" w:cs="Times New Roman"/>
+          <w:highlight w:val="magenta"/>
+        </w:rPr>
+        <w:t>countergradient</w:t>
+      </w:r>
+      <w:proofErr w:type="spellEnd"/>
+      <w:r>
+        <w:rPr>
+          <w:rFonts w:ascii="Times New Roman" w:hAnsi="Times New Roman" w:cs="Times New Roman"/>
+          <w:highlight w:val="magenta"/>
+        </w:rPr>
+        <w:t xml:space="preserve"> variation.</w:t>
       </w:r>
       <w:r>
         <w:rPr>
@@ -3220,7 +3750,25 @@
           <w:i/>
           <w:iCs/>
         </w:rPr>
-        <w:t>Trends Ecol Evol.</w:t>
+        <w:t xml:space="preserve">Trends </w:t>
+      </w:r>
+      <w:proofErr w:type="spellStart"/>
+      <w:r>
+        <w:rPr>
+          <w:rFonts w:ascii="Times New Roman" w:hAnsi="Times New Roman" w:cs="Times New Roman"/>
+          <w:i/>
+          <w:iCs/>
+        </w:rPr>
+        <w:t>Ecol</w:t>
+      </w:r>
+      <w:proofErr w:type="spellEnd"/>
+      <w:r>
+        <w:rPr>
+          <w:rFonts w:ascii="Times New Roman" w:hAnsi="Times New Roman" w:cs="Times New Roman"/>
+          <w:i/>
+          <w:iCs/>
+        </w:rPr>
+        <w:t xml:space="preserve"> Evol.</w:t>
       </w:r>
       <w:r>
         <w:rPr>
@@ -3304,12 +3852,21 @@
           <w:rFonts w:ascii="Times New Roman" w:hAnsi="Times New Roman" w:cs="Times New Roman"/>
         </w:rPr>
       </w:pPr>
+      <w:proofErr w:type="spellStart"/>
       <w:r>
         <w:rPr>
           <w:rFonts w:ascii="Times New Roman" w:hAnsi="Times New Roman" w:cs="Times New Roman"/>
           <w:highlight w:val="magenta"/>
         </w:rPr>
-        <w:t>Kingslover J.G. 2001. Variation, selection and evolution of function-valued traits</w:t>
+        <w:t>Kingslover</w:t>
+      </w:r>
+      <w:proofErr w:type="spellEnd"/>
+      <w:r>
+        <w:rPr>
+          <w:rFonts w:ascii="Times New Roman" w:hAnsi="Times New Roman" w:cs="Times New Roman"/>
+          <w:highlight w:val="magenta"/>
+        </w:rPr>
+        <w:t xml:space="preserve"> J.G. 2001. Variation, selection and evolution of function-valued traits</w:t>
       </w:r>
       <w:r>
         <w:rPr>
@@ -3317,13 +3874,23 @@
         </w:rPr>
         <w:t xml:space="preserve">. </w:t>
       </w:r>
+      <w:proofErr w:type="spellStart"/>
       <w:r>
         <w:rPr>
           <w:rFonts w:ascii="Times New Roman" w:hAnsi="Times New Roman" w:cs="Times New Roman"/>
           <w:i/>
           <w:iCs/>
         </w:rPr>
-        <w:t>Genetica.</w:t>
+        <w:t>Genetica</w:t>
+      </w:r>
+      <w:proofErr w:type="spellEnd"/>
+      <w:r>
+        <w:rPr>
+          <w:rFonts w:ascii="Times New Roman" w:hAnsi="Times New Roman" w:cs="Times New Roman"/>
+          <w:i/>
+          <w:iCs/>
+        </w:rPr>
+        <w:t>.</w:t>
       </w:r>
       <w:r>
         <w:rPr>
@@ -3363,7 +3930,25 @@
           <w:i/>
           <w:iCs/>
         </w:rPr>
-        <w:t>Trends Ecol Evol.</w:t>
+        <w:t xml:space="preserve">Trends </w:t>
+      </w:r>
+      <w:proofErr w:type="spellStart"/>
+      <w:r>
+        <w:rPr>
+          <w:rFonts w:ascii="Times New Roman" w:hAnsi="Times New Roman" w:cs="Times New Roman"/>
+          <w:i/>
+          <w:iCs/>
+        </w:rPr>
+        <w:t>Ecol</w:t>
+      </w:r>
+      <w:proofErr w:type="spellEnd"/>
+      <w:r>
+        <w:rPr>
+          <w:rFonts w:ascii="Times New Roman" w:hAnsi="Times New Roman" w:cs="Times New Roman"/>
+          <w:i/>
+          <w:iCs/>
+        </w:rPr>
+        <w:t xml:space="preserve"> Evol.</w:t>
       </w:r>
       <w:r>
         <w:rPr>
@@ -3481,13 +4066,23 @@
         </w:rPr>
         <w:t xml:space="preserve">. </w:t>
       </w:r>
+      <w:proofErr w:type="spellStart"/>
       <w:r>
         <w:rPr>
           <w:rFonts w:ascii="Times New Roman" w:hAnsi="Times New Roman" w:cs="Times New Roman"/>
           <w:i/>
           <w:iCs/>
         </w:rPr>
-        <w:t>Ecol Lett.</w:t>
+        <w:t>Ecol</w:t>
+      </w:r>
+      <w:proofErr w:type="spellEnd"/>
+      <w:r>
+        <w:rPr>
+          <w:rFonts w:ascii="Times New Roman" w:hAnsi="Times New Roman" w:cs="Times New Roman"/>
+          <w:i/>
+          <w:iCs/>
+        </w:rPr>
+        <w:t xml:space="preserve"> Lett.</w:t>
       </w:r>
       <w:r>
         <w:rPr>
@@ -3742,7 +4337,25 @@
           <w:i/>
           <w:iCs/>
         </w:rPr>
-        <w:t>Trends Ecol Evol. 20:685–692.</w:t>
+        <w:t xml:space="preserve">Trends </w:t>
+      </w:r>
+      <w:proofErr w:type="spellStart"/>
+      <w:r>
+        <w:rPr>
+          <w:rFonts w:ascii="Times New Roman" w:hAnsi="Times New Roman" w:cs="Times New Roman"/>
+          <w:i/>
+          <w:iCs/>
+        </w:rPr>
+        <w:t>Ecol</w:t>
+      </w:r>
+      <w:proofErr w:type="spellEnd"/>
+      <w:r>
+        <w:rPr>
+          <w:rFonts w:ascii="Times New Roman" w:hAnsi="Times New Roman" w:cs="Times New Roman"/>
+          <w:i/>
+          <w:iCs/>
+        </w:rPr>
+        <w:t xml:space="preserve"> Evol. 20:685–692.</w:t>
       </w:r>
     </w:p>
     <w:p>
@@ -3805,6 +4418,7 @@
         </w:rPr>
         <w:t xml:space="preserve">resilience to climate change for </w:t>
       </w:r>
+      <w:proofErr w:type="spellStart"/>
       <w:r>
         <w:rPr>
           <w:rFonts w:ascii="Times New Roman" w:hAnsi="Times New Roman" w:cs="Times New Roman"/>
@@ -3813,6 +4427,7 @@
         </w:rPr>
         <w:t>Eriophorum</w:t>
       </w:r>
+      <w:proofErr w:type="spellEnd"/>
       <w:r>
         <w:rPr>
           <w:rFonts w:ascii="Times New Roman" w:hAnsi="Times New Roman" w:cs="Times New Roman"/>
@@ -3821,6 +4436,7 @@
         </w:rPr>
         <w:t xml:space="preserve"> </w:t>
       </w:r>
+      <w:proofErr w:type="spellStart"/>
       <w:r>
         <w:rPr>
           <w:rFonts w:ascii="Times New Roman" w:hAnsi="Times New Roman" w:cs="Times New Roman"/>
@@ -3829,6 +4445,7 @@
         </w:rPr>
         <w:t>vaginatum</w:t>
       </w:r>
+      <w:proofErr w:type="spellEnd"/>
       <w:r>
         <w:rPr>
           <w:rFonts w:ascii="Times New Roman" w:hAnsi="Times New Roman" w:cs="Times New Roman"/>
@@ -3956,7 +4573,35 @@
         <w:rPr>
           <w:rFonts w:ascii="Times New Roman" w:hAnsi="Times New Roman" w:cs="Times New Roman"/>
         </w:rPr>
-        <w:t>Fluctuating temperature did not affect mean responses in any of the traits measured by very much (usually n.s. between Δtemperature regimes)</w:t>
+        <w:t xml:space="preserve">Fluctuating temperature did not affect mean responses in any of the traits measured by very much (usually </w:t>
+      </w:r>
+      <w:proofErr w:type="spellStart"/>
+      <w:r>
+        <w:rPr>
+          <w:rFonts w:ascii="Times New Roman" w:hAnsi="Times New Roman" w:cs="Times New Roman"/>
+        </w:rPr>
+        <w:t>n.s</w:t>
+      </w:r>
+      <w:proofErr w:type="spellEnd"/>
+      <w:r>
+        <w:rPr>
+          <w:rFonts w:ascii="Times New Roman" w:hAnsi="Times New Roman" w:cs="Times New Roman"/>
+        </w:rPr>
+        <w:t xml:space="preserve">. between </w:t>
+      </w:r>
+      <w:proofErr w:type="spellStart"/>
+      <w:r>
+        <w:rPr>
+          <w:rFonts w:ascii="Times New Roman" w:hAnsi="Times New Roman" w:cs="Times New Roman"/>
+        </w:rPr>
+        <w:t>Δtemperature</w:t>
+      </w:r>
+      <w:proofErr w:type="spellEnd"/>
+      <w:r>
+        <w:rPr>
+          <w:rFonts w:ascii="Times New Roman" w:hAnsi="Times New Roman" w:cs="Times New Roman"/>
+        </w:rPr>
+        <w:t xml:space="preserve"> regimes)</w:t>
       </w:r>
     </w:p>
     <w:p>
@@ -4034,11 +4679,19 @@
           <w:rFonts w:ascii="Times New Roman" w:hAnsi="Times New Roman" w:cs="Times New Roman"/>
         </w:rPr>
       </w:pPr>
-      <w:r>
-        <w:rPr>
-          <w:rFonts w:ascii="Times New Roman" w:hAnsi="Times New Roman" w:cs="Times New Roman"/>
-        </w:rPr>
-        <w:t>Lutterschmidt WI, Hutchison VH. 1997 The critical</w:t>
+      <w:proofErr w:type="spellStart"/>
+      <w:r>
+        <w:rPr>
+          <w:rFonts w:ascii="Times New Roman" w:hAnsi="Times New Roman" w:cs="Times New Roman"/>
+        </w:rPr>
+        <w:t>Lutterschmidt</w:t>
+      </w:r>
+      <w:proofErr w:type="spellEnd"/>
+      <w:r>
+        <w:rPr>
+          <w:rFonts w:ascii="Times New Roman" w:hAnsi="Times New Roman" w:cs="Times New Roman"/>
+        </w:rPr>
+        <w:t xml:space="preserve"> WI, Hutchison VH. 1997 The critical</w:t>
       </w:r>
       <w:r>
         <w:rPr>
@@ -4060,6 +4713,86 @@
           <w:rFonts w:ascii="Times New Roman" w:hAnsi="Times New Roman" w:cs="Times New Roman"/>
         </w:rPr>
       </w:pPr>
+      <w:r>
+        <w:rPr>
+          <w:rFonts w:ascii="Times New Roman" w:hAnsi="Times New Roman" w:cs="Times New Roman"/>
+          <w:b/>
+          <w:bCs/>
+        </w:rPr>
+        <w:t>Lenormand (2002)</w:t>
+      </w:r>
+    </w:p>
+    <w:p>
+      <w:pPr>
+        <w:spacing w:after="0" w:line="240" w:lineRule="auto"/>
+        <w:rPr>
+          <w:rFonts w:ascii="Times New Roman" w:hAnsi="Times New Roman" w:cs="Times New Roman"/>
+        </w:rPr>
+      </w:pPr>
+      <w:r>
+        <w:rPr>
+          <w:rFonts w:ascii="Times New Roman" w:hAnsi="Times New Roman" w:cs="Times New Roman"/>
+        </w:rPr>
+        <w:t>Gene flow and limits to adaptation</w:t>
+      </w:r>
+    </w:p>
+    <w:p>
+      <w:pPr>
+        <w:spacing w:after="0" w:line="240" w:lineRule="auto"/>
+        <w:rPr>
+          <w:rFonts w:ascii="Times New Roman" w:hAnsi="Times New Roman" w:cs="Times New Roman"/>
+        </w:rPr>
+      </w:pPr>
+    </w:p>
+    <w:p>
+      <w:pPr>
+        <w:pStyle w:val="ListParagraph"/>
+        <w:numPr>
+          <w:ilvl w:val="0"/>
+          <w:numId w:val="4"/>
+        </w:numPr>
+        <w:spacing w:after="0" w:line="240" w:lineRule="auto"/>
+        <w:rPr>
+          <w:rFonts w:ascii="Times New Roman" w:hAnsi="Times New Roman" w:cs="Times New Roman"/>
+        </w:rPr>
+      </w:pPr>
+      <w:r>
+        <w:rPr>
+          <w:rFonts w:ascii="Times New Roman" w:hAnsi="Times New Roman" w:cs="Times New Roman"/>
+          <w:i/>
+          <w:iCs/>
+        </w:rPr>
+        <w:t xml:space="preserve"> When scale of variation and selection mismatch</w:t>
+      </w:r>
+    </w:p>
+    <w:p>
+      <w:pPr>
+        <w:pStyle w:val="ListParagraph"/>
+        <w:numPr>
+          <w:ilvl w:val="0"/>
+          <w:numId w:val="4"/>
+        </w:numPr>
+        <w:spacing w:after="0" w:line="240" w:lineRule="auto"/>
+        <w:rPr>
+          <w:rFonts w:ascii="Times New Roman" w:hAnsi="Times New Roman" w:cs="Times New Roman"/>
+        </w:rPr>
+      </w:pPr>
+      <w:r>
+        <w:rPr>
+          <w:rFonts w:ascii="Times New Roman" w:hAnsi="Times New Roman" w:cs="Times New Roman"/>
+          <w:i/>
+          <w:iCs/>
+        </w:rPr>
+        <w:t>For discussion</w:t>
+      </w:r>
+      <w:r>
+        <w:rPr>
+          <w:rFonts w:ascii="Times New Roman" w:hAnsi="Times New Roman" w:cs="Times New Roman"/>
+          <w:i/>
+          <w:iCs/>
+        </w:rPr>
+        <w:t>?</w:t>
+      </w:r>
     </w:p>
     <w:p>
       <w:pPr>
@@ -5865,7 +6598,21 @@
         <w:rPr>
           <w:rFonts w:ascii="Times New Roman" w:hAnsi="Times New Roman" w:cs="Times New Roman"/>
         </w:rPr>
-        <w:t xml:space="preserve"> logistic growth equation was fit to population growth data using the package growthrates </w:t>
+        <w:t xml:space="preserve"> logistic growth equation was fit to population growth data using the package </w:t>
+      </w:r>
+      <w:proofErr w:type="spellStart"/>
+      <w:r>
+        <w:rPr>
+          <w:rFonts w:ascii="Times New Roman" w:hAnsi="Times New Roman" w:cs="Times New Roman"/>
+        </w:rPr>
+        <w:t>growthrates</w:t>
+      </w:r>
+      <w:proofErr w:type="spellEnd"/>
+      <w:r>
+        <w:rPr>
+          <w:rFonts w:ascii="Times New Roman" w:hAnsi="Times New Roman" w:cs="Times New Roman"/>
+        </w:rPr>
+        <w:t xml:space="preserve"> </w:t>
       </w:r>
       <w:r>
         <w:rPr>
@@ -6108,12 +6855,14 @@
         </w:rPr>
         <w:t xml:space="preserve">This formulation was implemented as a user-specified growth model within </w:t>
       </w:r>
+      <w:proofErr w:type="spellStart"/>
       <w:r>
         <w:rPr>
           <w:rFonts w:ascii="Times New Roman" w:hAnsi="Times New Roman" w:cs="Times New Roman"/>
         </w:rPr>
         <w:t>growthrates</w:t>
       </w:r>
+      <w:proofErr w:type="spellEnd"/>
       <w:r>
         <w:rPr>
           <w:rFonts w:ascii="Times New Roman" w:hAnsi="Times New Roman" w:cs="Times New Roman"/>
@@ -6657,7 +7406,35 @@
         <w:rPr>
           <w:rFonts w:ascii="Times New Roman" w:hAnsi="Times New Roman" w:cs="Times New Roman"/>
         </w:rPr>
-        <w:t>) of each replicate was estimated by fitting a smoothing spline to log-transformed abundance data using the fit_spline() function in the growthrates package. Maximum growth rate was defined by equation (3) as the first derivative of the fitted spline over time</w:t>
+        <w:t xml:space="preserve">) of each replicate was estimated by fitting a smoothing spline to log-transformed abundance data using the </w:t>
+      </w:r>
+      <w:proofErr w:type="spellStart"/>
+      <w:r>
+        <w:rPr>
+          <w:rFonts w:ascii="Times New Roman" w:hAnsi="Times New Roman" w:cs="Times New Roman"/>
+        </w:rPr>
+        <w:t>fit_spline</w:t>
+      </w:r>
+      <w:proofErr w:type="spellEnd"/>
+      <w:r>
+        <w:rPr>
+          <w:rFonts w:ascii="Times New Roman" w:hAnsi="Times New Roman" w:cs="Times New Roman"/>
+        </w:rPr>
+        <w:t xml:space="preserve">() function in the </w:t>
+      </w:r>
+      <w:proofErr w:type="spellStart"/>
+      <w:r>
+        <w:rPr>
+          <w:rFonts w:ascii="Times New Roman" w:hAnsi="Times New Roman" w:cs="Times New Roman"/>
+        </w:rPr>
+        <w:t>growthrates</w:t>
+      </w:r>
+      <w:proofErr w:type="spellEnd"/>
+      <w:r>
+        <w:rPr>
+          <w:rFonts w:ascii="Times New Roman" w:hAnsi="Times New Roman" w:cs="Times New Roman"/>
+        </w:rPr>
+        <w:t xml:space="preserve"> package. Maximum growth rate was defined by equation (3) as the first derivative of the fitted spline over time</w:t>
       </w:r>
       <w:r>
         <w:rPr>
@@ -7039,12 +7816,21 @@
         </w:rPr>
         <w:t>From each video, still frames were saved each time a unique individual rotifer was visible out-stretched and flat against the surface of the slide. The resulting images were processed with a combination of object identification models (</w:t>
       </w:r>
+      <w:proofErr w:type="spellStart"/>
       <w:r>
         <w:rPr>
           <w:rFonts w:ascii="Times New Roman" w:hAnsi="Times New Roman" w:cs="Times New Roman"/>
           <w:highlight w:val="yellow"/>
         </w:rPr>
-        <w:t>YOLOvxx xxx</w:t>
+        <w:t>YOLOvxx</w:t>
+      </w:r>
+      <w:proofErr w:type="spellEnd"/>
+      <w:r>
+        <w:rPr>
+          <w:rFonts w:ascii="Times New Roman" w:hAnsi="Times New Roman" w:cs="Times New Roman"/>
+          <w:highlight w:val="yellow"/>
+        </w:rPr>
+        <w:t xml:space="preserve"> xxx</w:t>
       </w:r>
       <w:r>
         <w:rPr>
@@ -7052,12 +7838,21 @@
         </w:rPr>
         <w:t>) and pixel classification models (</w:t>
       </w:r>
+      <w:proofErr w:type="spellStart"/>
       <w:r>
         <w:rPr>
           <w:rFonts w:ascii="Times New Roman" w:hAnsi="Times New Roman" w:cs="Times New Roman"/>
           <w:highlight w:val="yellow"/>
         </w:rPr>
-        <w:t>Ilastik, xxx</w:t>
+        <w:t>Ilastik</w:t>
+      </w:r>
+      <w:proofErr w:type="spellEnd"/>
+      <w:r>
+        <w:rPr>
+          <w:rFonts w:ascii="Times New Roman" w:hAnsi="Times New Roman" w:cs="Times New Roman"/>
+          <w:highlight w:val="yellow"/>
+        </w:rPr>
+        <w:t>, xxx</w:t>
       </w:r>
       <w:r>
         <w:rPr>
@@ -7070,8 +7865,33 @@
           <w:rFonts w:ascii="Times New Roman" w:hAnsi="Times New Roman" w:cs="Times New Roman"/>
           <w:highlight w:val="yellow"/>
         </w:rPr>
-        <w:t>cv2 vxxx, Python vxxx</w:t>
-      </w:r>
+        <w:t xml:space="preserve">cv2 </w:t>
+      </w:r>
+      <w:proofErr w:type="spellStart"/>
+      <w:r>
+        <w:rPr>
+          <w:rFonts w:ascii="Times New Roman" w:hAnsi="Times New Roman" w:cs="Times New Roman"/>
+          <w:highlight w:val="yellow"/>
+        </w:rPr>
+        <w:t>vxxx</w:t>
+      </w:r>
+      <w:proofErr w:type="spellEnd"/>
+      <w:r>
+        <w:rPr>
+          <w:rFonts w:ascii="Times New Roman" w:hAnsi="Times New Roman" w:cs="Times New Roman"/>
+          <w:highlight w:val="yellow"/>
+        </w:rPr>
+        <w:t xml:space="preserve">, Python </w:t>
+      </w:r>
+      <w:proofErr w:type="spellStart"/>
+      <w:r>
+        <w:rPr>
+          <w:rFonts w:ascii="Times New Roman" w:hAnsi="Times New Roman" w:cs="Times New Roman"/>
+          <w:highlight w:val="yellow"/>
+        </w:rPr>
+        <w:t>vxxx</w:t>
+      </w:r>
+      <w:proofErr w:type="spellEnd"/>
       <w:r>
         <w:rPr>
           <w:rFonts w:ascii="Times New Roman" w:hAnsi="Times New Roman" w:cs="Times New Roman"/>
@@ -9461,12 +10281,14 @@
         </w:rPr>
         <w:t xml:space="preserve"> (</w:t>
       </w:r>
+      <w:proofErr w:type="spellStart"/>
       <w:r>
         <w:rPr>
           <w:rFonts w:ascii="Times New Roman" w:hAnsi="Times New Roman" w:cs="Times New Roman"/>
         </w:rPr>
         <w:t>Devetter</w:t>
       </w:r>
+      <w:proofErr w:type="spellEnd"/>
       <w:r>
         <w:rPr>
           <w:rFonts w:ascii="Times New Roman" w:hAnsi="Times New Roman" w:cs="Times New Roman"/>
@@ -9788,11 +10610,19 @@
           <w:rFonts w:ascii="Times New Roman" w:hAnsi="Times New Roman" w:cs="Times New Roman"/>
         </w:rPr>
       </w:pPr>
-      <w:r>
-        <w:rPr>
-          <w:rFonts w:ascii="Times New Roman" w:hAnsi="Times New Roman" w:cs="Times New Roman"/>
-        </w:rPr>
-        <w:t>Rausher and Simms 1989.</w:t>
+      <w:proofErr w:type="spellStart"/>
+      <w:r>
+        <w:rPr>
+          <w:rFonts w:ascii="Times New Roman" w:hAnsi="Times New Roman" w:cs="Times New Roman"/>
+        </w:rPr>
+        <w:t>Rausher</w:t>
+      </w:r>
+      <w:proofErr w:type="spellEnd"/>
+      <w:r>
+        <w:rPr>
+          <w:rFonts w:ascii="Times New Roman" w:hAnsi="Times New Roman" w:cs="Times New Roman"/>
+        </w:rPr>
+        <w:t xml:space="preserve"> and Simms 1989.</w:t>
       </w:r>
     </w:p>
     <w:p>
@@ -9810,11 +10640,19 @@
           <w:rFonts w:ascii="Times New Roman" w:hAnsi="Times New Roman" w:cs="Times New Roman"/>
         </w:rPr>
       </w:pPr>
-      <w:r>
-        <w:rPr>
-          <w:rFonts w:ascii="Times New Roman" w:hAnsi="Times New Roman" w:cs="Times New Roman"/>
-        </w:rPr>
-        <w:t>Laukau 2007.</w:t>
+      <w:proofErr w:type="spellStart"/>
+      <w:r>
+        <w:rPr>
+          <w:rFonts w:ascii="Times New Roman" w:hAnsi="Times New Roman" w:cs="Times New Roman"/>
+        </w:rPr>
+        <w:t>Laukau</w:t>
+      </w:r>
+      <w:proofErr w:type="spellEnd"/>
+      <w:r>
+        <w:rPr>
+          <w:rFonts w:ascii="Times New Roman" w:hAnsi="Times New Roman" w:cs="Times New Roman"/>
+        </w:rPr>
+        <w:t xml:space="preserve"> 2007.</w:t>
       </w:r>
     </w:p>
     <w:p>
@@ -9854,11 +10692,33 @@
           <w:rFonts w:ascii="Times New Roman" w:hAnsi="Times New Roman" w:cs="Times New Roman"/>
         </w:rPr>
       </w:pPr>
-      <w:r>
-        <w:rPr>
-          <w:rFonts w:ascii="Times New Roman" w:hAnsi="Times New Roman" w:cs="Times New Roman"/>
-        </w:rPr>
-        <w:t>Leimu and Koricheva 2006.</w:t>
+      <w:proofErr w:type="spellStart"/>
+      <w:r>
+        <w:rPr>
+          <w:rFonts w:ascii="Times New Roman" w:hAnsi="Times New Roman" w:cs="Times New Roman"/>
+        </w:rPr>
+        <w:t>Leimu</w:t>
+      </w:r>
+      <w:proofErr w:type="spellEnd"/>
+      <w:r>
+        <w:rPr>
+          <w:rFonts w:ascii="Times New Roman" w:hAnsi="Times New Roman" w:cs="Times New Roman"/>
+        </w:rPr>
+        <w:t xml:space="preserve"> and </w:t>
+      </w:r>
+      <w:proofErr w:type="spellStart"/>
+      <w:r>
+        <w:rPr>
+          <w:rFonts w:ascii="Times New Roman" w:hAnsi="Times New Roman" w:cs="Times New Roman"/>
+        </w:rPr>
+        <w:t>Koricheva</w:t>
+      </w:r>
+      <w:proofErr w:type="spellEnd"/>
+      <w:r>
+        <w:rPr>
+          <w:rFonts w:ascii="Times New Roman" w:hAnsi="Times New Roman" w:cs="Times New Roman"/>
+        </w:rPr>
+        <w:t xml:space="preserve"> 2006.</w:t>
       </w:r>
     </w:p>
     <w:p>
@@ -9876,11 +10736,19 @@
           <w:rFonts w:ascii="Times New Roman" w:hAnsi="Times New Roman" w:cs="Times New Roman"/>
         </w:rPr>
       </w:pPr>
-      <w:r>
-        <w:rPr>
-          <w:rFonts w:ascii="Times New Roman" w:hAnsi="Times New Roman" w:cs="Times New Roman"/>
-        </w:rPr>
-        <w:t>Lankau and Strauss 2008.</w:t>
+      <w:proofErr w:type="spellStart"/>
+      <w:r>
+        <w:rPr>
+          <w:rFonts w:ascii="Times New Roman" w:hAnsi="Times New Roman" w:cs="Times New Roman"/>
+        </w:rPr>
+        <w:t>Lankau</w:t>
+      </w:r>
+      <w:proofErr w:type="spellEnd"/>
+      <w:r>
+        <w:rPr>
+          <w:rFonts w:ascii="Times New Roman" w:hAnsi="Times New Roman" w:cs="Times New Roman"/>
+        </w:rPr>
+        <w:t xml:space="preserve"> and Strauss 2008.</w:t>
       </w:r>
     </w:p>
     <w:p>
@@ -9898,11 +10766,19 @@
           <w:rFonts w:ascii="Times New Roman" w:hAnsi="Times New Roman" w:cs="Times New Roman"/>
         </w:rPr>
       </w:pPr>
-      <w:r>
-        <w:rPr>
-          <w:rFonts w:ascii="Times New Roman" w:hAnsi="Times New Roman" w:cs="Times New Roman"/>
-        </w:rPr>
-        <w:t>Lankau 2009.</w:t>
+      <w:proofErr w:type="spellStart"/>
+      <w:r>
+        <w:rPr>
+          <w:rFonts w:ascii="Times New Roman" w:hAnsi="Times New Roman" w:cs="Times New Roman"/>
+        </w:rPr>
+        <w:t>Lankau</w:t>
+      </w:r>
+      <w:proofErr w:type="spellEnd"/>
+      <w:r>
+        <w:rPr>
+          <w:rFonts w:ascii="Times New Roman" w:hAnsi="Times New Roman" w:cs="Times New Roman"/>
+        </w:rPr>
+        <w:t xml:space="preserve"> 2009.</w:t>
       </w:r>
     </w:p>
     <w:p>
@@ -9980,11 +10856,19 @@
           <w:rFonts w:ascii="Times New Roman" w:hAnsi="Times New Roman" w:cs="Times New Roman"/>
         </w:rPr>
       </w:pPr>
-      <w:r>
-        <w:rPr>
-          <w:rFonts w:ascii="Times New Roman" w:hAnsi="Times New Roman" w:cs="Times New Roman"/>
-        </w:rPr>
-        <w:t xml:space="preserve">Devetter 2007. </w:t>
+      <w:proofErr w:type="spellStart"/>
+      <w:r>
+        <w:rPr>
+          <w:rFonts w:ascii="Times New Roman" w:hAnsi="Times New Roman" w:cs="Times New Roman"/>
+        </w:rPr>
+        <w:t>Devetter</w:t>
+      </w:r>
+      <w:proofErr w:type="spellEnd"/>
+      <w:r>
+        <w:rPr>
+          <w:rFonts w:ascii="Times New Roman" w:hAnsi="Times New Roman" w:cs="Times New Roman"/>
+        </w:rPr>
+        <w:t xml:space="preserve"> 2007. </w:t>
       </w:r>
       <w:r>
         <w:rPr>
@@ -9998,8 +10882,18 @@
           <w:i/>
           <w:iCs/>
         </w:rPr>
-        <w:t>Habrotrocha thienemanni</w:t>
-      </w:r>
+        <w:t xml:space="preserve">Habrotrocha </w:t>
+      </w:r>
+      <w:proofErr w:type="spellStart"/>
+      <w:r>
+        <w:rPr>
+          <w:rFonts w:ascii="Times New Roman" w:hAnsi="Times New Roman" w:cs="Times New Roman"/>
+          <w:i/>
+          <w:iCs/>
+        </w:rPr>
+        <w:t>thienemanni</w:t>
+      </w:r>
+      <w:proofErr w:type="spellEnd"/>
       <w:r>
         <w:rPr>
           <w:rFonts w:ascii="Times New Roman" w:hAnsi="Times New Roman" w:cs="Times New Roman"/>
@@ -10325,6 +11219,119 @@
 <file path=word/numbering.xml><?xml version="1.0" encoding="utf-8"?>
 <w:numbering xmlns:wpc="http://schemas.microsoft.com/office/word/2010/wordprocessingCanvas" xmlns:cx="http://schemas.microsoft.com/office/drawing/2014/chartex" xmlns:cx1="http://schemas.microsoft.com/office/drawing/2015/9/8/chartex" xmlns:cx2="http://schemas.microsoft.com/office/drawing/2015/10/21/chartex" xmlns:cx3="http://schemas.microsoft.com/office/drawing/2016/5/9/chartex" xmlns:cx4="http://schemas.microsoft.com/office/drawing/2016/5/10/chartex" xmlns:cx5="http://schemas.microsoft.com/office/drawing/2016/5/11/chartex" xmlns:cx6="http://schemas.microsoft.com/office/drawing/2016/5/12/chartex" xmlns:cx7="http://schemas.microsoft.com/office/drawing/2016/5/13/chartex" xmlns:cx8="http://schemas.microsoft.com/office/drawing/2016/5/14/chartex" xmlns:mc="http://schemas.openxmlformats.org/markup-compatibility/2006" xmlns:aink="http://schemas.microsoft.com/office/drawing/2016/ink" xmlns:am3d="http://schemas.microsoft.com/office/drawing/2017/model3d" xmlns:o="urn:schemas-microsoft-com:office:office" xmlns:oel="http://schemas.microsoft.com/office/2019/extlst" xmlns:r="http://schemas.openxmlformats.org/officeDocument/2006/relationships" xmlns:m="http://schemas.openxmlformats.org/officeDocument/2006/math" xmlns:v="urn:schemas-microsoft-com:vml" xmlns:wp14="http://schemas.microsoft.com/office/word/2010/wordprocessingDrawing" xmlns:wp="http://schemas.openxmlformats.org/drawingml/2006/wordprocessingDrawing" xmlns:w10="urn:schemas-microsoft-com:office:word" xmlns:w="http://schemas.openxmlformats.org/wordprocessingml/2006/main" xmlns:w14="http://schemas.microsoft.com/office/word/2010/wordml" xmlns:w15="http://schemas.microsoft.com/office/word/2012/wordml" xmlns:w16cex="http://schemas.microsoft.com/office/word/2018/wordml/cex" xmlns:w16cid="http://schemas.microsoft.com/office/word/2016/wordml/cid" xmlns:w16="http://schemas.microsoft.com/office/word/2018/wordml" xmlns:w16du="http://schemas.microsoft.com/office/word/2023/wordml/word16du" xmlns:w16sdtdh="http://schemas.microsoft.com/office/word/2020/wordml/sdtdatahash" xmlns:w16sdtfl="http://schemas.microsoft.com/office/word/2024/wordml/sdtformatlock" xmlns:w16se="http://schemas.microsoft.com/office/word/2015/wordml/symex" xmlns:wpg="http://schemas.microsoft.com/office/word/2010/wordprocessingGroup" xmlns:wpi="http://schemas.microsoft.com/office/word/2010/wordprocessingInk" xmlns:wne="http://schemas.microsoft.com/office/word/2006/wordml" xmlns:wps="http://schemas.microsoft.com/office/word/2010/wordprocessingShape" mc:Ignorable="w14 w15 w16se w16cid w16 w16cex w16sdtdh w16sdtfl w16du wp14">
   <w:abstractNum w:abstractNumId="0" w15:restartNumberingAfterBreak="0">
+    <w:nsid w:val="006A2186"/>
+    <w:multiLevelType w:val="hybridMultilevel"/>
+    <w:tmpl w:val="A934B8D8"/>
+    <w:lvl w:ilvl="0" w:tplc="04090001">
+      <w:start w:val="1"/>
+      <w:numFmt w:val="bullet"/>
+      <w:lvlText w:val=""/>
+      <w:lvlJc w:val="left"/>
+      <w:pPr>
+        <w:ind w:left="720" w:hanging="360"/>
+      </w:pPr>
+      <w:rPr>
+        <w:rFonts w:ascii="Symbol" w:hAnsi="Symbol" w:hint="default"/>
+      </w:rPr>
+    </w:lvl>
+    <w:lvl w:ilvl="1" w:tplc="04090003" w:tentative="1">
+      <w:start w:val="1"/>
+      <w:numFmt w:val="bullet"/>
+      <w:lvlText w:val="o"/>
+      <w:lvlJc w:val="left"/>
+      <w:pPr>
+        <w:ind w:left="1440" w:hanging="360"/>
+      </w:pPr>
+      <w:rPr>
+        <w:rFonts w:ascii="Courier New" w:hAnsi="Courier New" w:cs="Courier New" w:hint="default"/>
+      </w:rPr>
+    </w:lvl>
+    <w:lvl w:ilvl="2" w:tplc="04090005" w:tentative="1">
+      <w:start w:val="1"/>
+      <w:numFmt w:val="bullet"/>
+      <w:lvlText w:val=""/>
+      <w:lvlJc w:val="left"/>
+      <w:pPr>
+        <w:ind w:left="2160" w:hanging="360"/>
+      </w:pPr>
+      <w:rPr>
+        <w:rFonts w:ascii="Wingdings" w:hAnsi="Wingdings" w:hint="default"/>
+      </w:rPr>
+    </w:lvl>
+    <w:lvl w:ilvl="3" w:tplc="04090001" w:tentative="1">
+      <w:start w:val="1"/>
+      <w:numFmt w:val="bullet"/>
+      <w:lvlText w:val=""/>
+      <w:lvlJc w:val="left"/>
+      <w:pPr>
+        <w:ind w:left="2880" w:hanging="360"/>
+      </w:pPr>
+      <w:rPr>
+        <w:rFonts w:ascii="Symbol" w:hAnsi="Symbol" w:hint="default"/>
+      </w:rPr>
+    </w:lvl>
+    <w:lvl w:ilvl="4" w:tplc="04090003" w:tentative="1">
+      <w:start w:val="1"/>
+      <w:numFmt w:val="bullet"/>
+      <w:lvlText w:val="o"/>
+      <w:lvlJc w:val="left"/>
+      <w:pPr>
+        <w:ind w:left="3600" w:hanging="360"/>
+      </w:pPr>
+      <w:rPr>
+        <w:rFonts w:ascii="Courier New" w:hAnsi="Courier New" w:cs="Courier New" w:hint="default"/>
+      </w:rPr>
+    </w:lvl>
+    <w:lvl w:ilvl="5" w:tplc="04090005" w:tentative="1">
+      <w:start w:val="1"/>
+      <w:numFmt w:val="bullet"/>
+      <w:lvlText w:val=""/>
+      <w:lvlJc w:val="left"/>
+      <w:pPr>
+        <w:ind w:left="4320" w:hanging="360"/>
+      </w:pPr>
+      <w:rPr>
+        <w:rFonts w:ascii="Wingdings" w:hAnsi="Wingdings" w:hint="default"/>
+      </w:rPr>
+    </w:lvl>
+    <w:lvl w:ilvl="6" w:tplc="04090001" w:tentative="1">
+      <w:start w:val="1"/>
+      <w:numFmt w:val="bullet"/>
+      <w:lvlText w:val=""/>
+      <w:lvlJc w:val="left"/>
+      <w:pPr>
+        <w:ind w:left="5040" w:hanging="360"/>
+      </w:pPr>
+      <w:rPr>
+        <w:rFonts w:ascii="Symbol" w:hAnsi="Symbol" w:hint="default"/>
+      </w:rPr>
+    </w:lvl>
+    <w:lvl w:ilvl="7" w:tplc="04090003" w:tentative="1">
+      <w:start w:val="1"/>
+      <w:numFmt w:val="bullet"/>
+      <w:lvlText w:val="o"/>
+      <w:lvlJc w:val="left"/>
+      <w:pPr>
+        <w:ind w:left="5760" w:hanging="360"/>
+      </w:pPr>
+      <w:rPr>
+        <w:rFonts w:ascii="Courier New" w:hAnsi="Courier New" w:cs="Courier New" w:hint="default"/>
+      </w:rPr>
+    </w:lvl>
+    <w:lvl w:ilvl="8" w:tplc="04090005" w:tentative="1">
+      <w:start w:val="1"/>
+      <w:numFmt w:val="bullet"/>
+      <w:lvlText w:val=""/>
+      <w:lvlJc w:val="left"/>
+      <w:pPr>
+        <w:ind w:left="6480" w:hanging="360"/>
+      </w:pPr>
+      <w:rPr>
+        <w:rFonts w:ascii="Wingdings" w:hAnsi="Wingdings" w:hint="default"/>
+      </w:rPr>
+    </w:lvl>
+  </w:abstractNum>
+  <w:abstractNum w:abstractNumId="1" w15:restartNumberingAfterBreak="0">
     <w:nsid w:val="0AD00C46"/>
     <w:multiLevelType w:val="hybridMultilevel"/>
     <w:tmpl w:val="29A29F12"/>
@@ -10436,7 +11443,7 @@
       </w:rPr>
     </w:lvl>
   </w:abstractNum>
-  <w:abstractNum w:abstractNumId="1" w15:restartNumberingAfterBreak="0">
+  <w:abstractNum w:abstractNumId="2" w15:restartNumberingAfterBreak="0">
     <w:nsid w:val="1E130746"/>
     <w:multiLevelType w:val="multilevel"/>
     <w:tmpl w:val="5B880882"/>
@@ -10585,7 +11592,7 @@
       </w:rPr>
     </w:lvl>
   </w:abstractNum>
-  <w:abstractNum w:abstractNumId="2" w15:restartNumberingAfterBreak="0">
+  <w:abstractNum w:abstractNumId="3" w15:restartNumberingAfterBreak="0">
     <w:nsid w:val="2CD822DA"/>
     <w:multiLevelType w:val="hybridMultilevel"/>
     <w:tmpl w:val="8036078C"/>
@@ -10698,7 +11705,7 @@
       </w:rPr>
     </w:lvl>
   </w:abstractNum>
-  <w:abstractNum w:abstractNumId="3" w15:restartNumberingAfterBreak="0">
+  <w:abstractNum w:abstractNumId="4" w15:restartNumberingAfterBreak="0">
     <w:nsid w:val="302F3BE9"/>
     <w:multiLevelType w:val="hybridMultilevel"/>
     <w:tmpl w:val="CF1A98FE"/>
@@ -10810,7 +11817,7 @@
       </w:rPr>
     </w:lvl>
   </w:abstractNum>
-  <w:abstractNum w:abstractNumId="4" w15:restartNumberingAfterBreak="0">
+  <w:abstractNum w:abstractNumId="5" w15:restartNumberingAfterBreak="0">
     <w:nsid w:val="40FA7818"/>
     <w:multiLevelType w:val="hybridMultilevel"/>
     <w:tmpl w:val="12721766"/>
@@ -10923,7 +11930,7 @@
       </w:rPr>
     </w:lvl>
   </w:abstractNum>
-  <w:abstractNum w:abstractNumId="5" w15:restartNumberingAfterBreak="0">
+  <w:abstractNum w:abstractNumId="6" w15:restartNumberingAfterBreak="0">
     <w:nsid w:val="43653347"/>
     <w:multiLevelType w:val="multilevel"/>
     <w:tmpl w:val="AE9E640A"/>
@@ -11072,7 +12079,7 @@
       </w:rPr>
     </w:lvl>
   </w:abstractNum>
-  <w:abstractNum w:abstractNumId="6" w15:restartNumberingAfterBreak="0">
+  <w:abstractNum w:abstractNumId="7" w15:restartNumberingAfterBreak="0">
     <w:nsid w:val="4EA305BB"/>
     <w:multiLevelType w:val="hybridMultilevel"/>
     <w:tmpl w:val="2D28D940"/>
@@ -11185,7 +12192,7 @@
       </w:rPr>
     </w:lvl>
   </w:abstractNum>
-  <w:abstractNum w:abstractNumId="7" w15:restartNumberingAfterBreak="0">
+  <w:abstractNum w:abstractNumId="8" w15:restartNumberingAfterBreak="0">
     <w:nsid w:val="50C55464"/>
     <w:multiLevelType w:val="hybridMultilevel"/>
     <w:tmpl w:val="D7B27892"/>
@@ -11297,7 +12304,7 @@
       </w:rPr>
     </w:lvl>
   </w:abstractNum>
-  <w:abstractNum w:abstractNumId="8" w15:restartNumberingAfterBreak="0">
+  <w:abstractNum w:abstractNumId="9" w15:restartNumberingAfterBreak="0">
     <w:nsid w:val="52653999"/>
     <w:multiLevelType w:val="hybridMultilevel"/>
     <w:tmpl w:val="81D2D4F0"/>
@@ -11409,7 +12416,120 @@
       </w:rPr>
     </w:lvl>
   </w:abstractNum>
-  <w:abstractNum w:abstractNumId="9" w15:restartNumberingAfterBreak="0">
+  <w:abstractNum w:abstractNumId="10" w15:restartNumberingAfterBreak="0">
+    <w:nsid w:val="610140A6"/>
+    <w:multiLevelType w:val="hybridMultilevel"/>
+    <w:tmpl w:val="D5B06D2A"/>
+    <w:lvl w:ilvl="0" w:tplc="AD16B2FA">
+      <w:start w:val="1"/>
+      <w:numFmt w:val="bullet"/>
+      <w:lvlText w:val="-"/>
+      <w:lvlJc w:val="left"/>
+      <w:pPr>
+        <w:ind w:left="720" w:hanging="360"/>
+      </w:pPr>
+      <w:rPr>
+        <w:rFonts w:ascii="Times New Roman" w:eastAsiaTheme="minorHAnsi" w:hAnsi="Times New Roman" w:cs="Times New Roman" w:hint="default"/>
+      </w:rPr>
+    </w:lvl>
+    <w:lvl w:ilvl="1" w:tplc="04090003" w:tentative="1">
+      <w:start w:val="1"/>
+      <w:numFmt w:val="bullet"/>
+      <w:lvlText w:val="o"/>
+      <w:lvlJc w:val="left"/>
+      <w:pPr>
+        <w:ind w:left="1440" w:hanging="360"/>
+      </w:pPr>
+      <w:rPr>
+        <w:rFonts w:ascii="Courier New" w:hAnsi="Courier New" w:cs="Courier New" w:hint="default"/>
+      </w:rPr>
+    </w:lvl>
+    <w:lvl w:ilvl="2" w:tplc="04090005" w:tentative="1">
+      <w:start w:val="1"/>
+      <w:numFmt w:val="bullet"/>
+      <w:lvlText w:val=""/>
+      <w:lvlJc w:val="left"/>
+      <w:pPr>
+        <w:ind w:left="2160" w:hanging="360"/>
+      </w:pPr>
+      <w:rPr>
+        <w:rFonts w:ascii="Wingdings" w:hAnsi="Wingdings" w:hint="default"/>
+      </w:rPr>
+    </w:lvl>
+    <w:lvl w:ilvl="3" w:tplc="04090001" w:tentative="1">
+      <w:start w:val="1"/>
+      <w:numFmt w:val="bullet"/>
+      <w:lvlText w:val=""/>
+      <w:lvlJc w:val="left"/>
+      <w:pPr>
+        <w:ind w:left="2880" w:hanging="360"/>
+      </w:pPr>
+      <w:rPr>
+        <w:rFonts w:ascii="Symbol" w:hAnsi="Symbol" w:hint="default"/>
+      </w:rPr>
+    </w:lvl>
+    <w:lvl w:ilvl="4" w:tplc="04090003" w:tentative="1">
+      <w:start w:val="1"/>
+      <w:numFmt w:val="bullet"/>
+      <w:lvlText w:val="o"/>
+      <w:lvlJc w:val="left"/>
+      <w:pPr>
+        <w:ind w:left="3600" w:hanging="360"/>
+      </w:pPr>
+      <w:rPr>
+        <w:rFonts w:ascii="Courier New" w:hAnsi="Courier New" w:cs="Courier New" w:hint="default"/>
+      </w:rPr>
+    </w:lvl>
+    <w:lvl w:ilvl="5" w:tplc="04090005" w:tentative="1">
+      <w:start w:val="1"/>
+      <w:numFmt w:val="bullet"/>
+      <w:lvlText w:val=""/>
+      <w:lvlJc w:val="left"/>
+      <w:pPr>
+        <w:ind w:left="4320" w:hanging="360"/>
+      </w:pPr>
+      <w:rPr>
+        <w:rFonts w:ascii="Wingdings" w:hAnsi="Wingdings" w:hint="default"/>
+      </w:rPr>
+    </w:lvl>
+    <w:lvl w:ilvl="6" w:tplc="04090001" w:tentative="1">
+      <w:start w:val="1"/>
+      <w:numFmt w:val="bullet"/>
+      <w:lvlText w:val=""/>
+      <w:lvlJc w:val="left"/>
+      <w:pPr>
+        <w:ind w:left="5040" w:hanging="360"/>
+      </w:pPr>
+      <w:rPr>
+        <w:rFonts w:ascii="Symbol" w:hAnsi="Symbol" w:hint="default"/>
+      </w:rPr>
+    </w:lvl>
+    <w:lvl w:ilvl="7" w:tplc="04090003" w:tentative="1">
+      <w:start w:val="1"/>
+      <w:numFmt w:val="bullet"/>
+      <w:lvlText w:val="o"/>
+      <w:lvlJc w:val="left"/>
+      <w:pPr>
+        <w:ind w:left="5760" w:hanging="360"/>
+      </w:pPr>
+      <w:rPr>
+        <w:rFonts w:ascii="Courier New" w:hAnsi="Courier New" w:cs="Courier New" w:hint="default"/>
+      </w:rPr>
+    </w:lvl>
+    <w:lvl w:ilvl="8" w:tplc="04090005" w:tentative="1">
+      <w:start w:val="1"/>
+      <w:numFmt w:val="bullet"/>
+      <w:lvlText w:val=""/>
+      <w:lvlJc w:val="left"/>
+      <w:pPr>
+        <w:ind w:left="6480" w:hanging="360"/>
+      </w:pPr>
+      <w:rPr>
+        <w:rFonts w:ascii="Wingdings" w:hAnsi="Wingdings" w:hint="default"/>
+      </w:rPr>
+    </w:lvl>
+  </w:abstractNum>
+  <w:abstractNum w:abstractNumId="11" w15:restartNumberingAfterBreak="0">
     <w:nsid w:val="6FCF38E4"/>
     <w:multiLevelType w:val="multilevel"/>
     <w:tmpl w:val="77242B24"/>
@@ -11558,7 +12678,7 @@
       </w:rPr>
     </w:lvl>
   </w:abstractNum>
-  <w:abstractNum w:abstractNumId="10" w15:restartNumberingAfterBreak="0">
+  <w:abstractNum w:abstractNumId="12" w15:restartNumberingAfterBreak="0">
     <w:nsid w:val="79AB5F15"/>
     <w:multiLevelType w:val="hybridMultilevel"/>
     <w:tmpl w:val="1234DA50"/>
@@ -11671,37 +12791,43 @@
     </w:lvl>
   </w:abstractNum>
   <w:num w:numId="1" w16cid:durableId="583538030">
+    <w:abstractNumId w:val="8"/>
+  </w:num>
+  <w:num w:numId="2" w16cid:durableId="595990029">
+    <w:abstractNumId w:val="4"/>
+  </w:num>
+  <w:num w:numId="3" w16cid:durableId="392047485">
+    <w:abstractNumId w:val="1"/>
+  </w:num>
+  <w:num w:numId="4" w16cid:durableId="804464942">
+    <w:abstractNumId w:val="12"/>
+  </w:num>
+  <w:num w:numId="5" w16cid:durableId="724453722">
+    <w:abstractNumId w:val="9"/>
+  </w:num>
+  <w:num w:numId="6" w16cid:durableId="752632309">
+    <w:abstractNumId w:val="11"/>
+  </w:num>
+  <w:num w:numId="7" w16cid:durableId="1358659136">
+    <w:abstractNumId w:val="2"/>
+  </w:num>
+  <w:num w:numId="8" w16cid:durableId="651829799">
+    <w:abstractNumId w:val="6"/>
+  </w:num>
+  <w:num w:numId="9" w16cid:durableId="73017824">
+    <w:abstractNumId w:val="5"/>
+  </w:num>
+  <w:num w:numId="10" w16cid:durableId="1224753280">
+    <w:abstractNumId w:val="3"/>
+  </w:num>
+  <w:num w:numId="11" w16cid:durableId="725836434">
     <w:abstractNumId w:val="7"/>
   </w:num>
-  <w:num w:numId="2" w16cid:durableId="595990029">
-    <w:abstractNumId w:val="3"/>
-  </w:num>
-  <w:num w:numId="3" w16cid:durableId="392047485">
+  <w:num w:numId="12" w16cid:durableId="455833611">
     <w:abstractNumId w:val="0"/>
   </w:num>
-  <w:num w:numId="4" w16cid:durableId="804464942">
+  <w:num w:numId="13" w16cid:durableId="1396513438">
     <w:abstractNumId w:val="10"/>
-  </w:num>
-  <w:num w:numId="5" w16cid:durableId="724453722">
-    <w:abstractNumId w:val="8"/>
-  </w:num>
-  <w:num w:numId="6" w16cid:durableId="752632309">
-    <w:abstractNumId w:val="9"/>
-  </w:num>
-  <w:num w:numId="7" w16cid:durableId="1358659136">
-    <w:abstractNumId w:val="1"/>
-  </w:num>
-  <w:num w:numId="8" w16cid:durableId="651829799">
-    <w:abstractNumId w:val="5"/>
-  </w:num>
-  <w:num w:numId="9" w16cid:durableId="73017824">
-    <w:abstractNumId w:val="4"/>
-  </w:num>
-  <w:num w:numId="10" w16cid:durableId="1224753280">
-    <w:abstractNumId w:val="2"/>
-  </w:num>
-  <w:num w:numId="11" w16cid:durableId="725836434">
-    <w:abstractNumId w:val="6"/>
   </w:num>
 </w:numbering>
 </file>
@@ -12106,6 +13232,7 @@
   <w:style w:type="paragraph" w:default="1" w:styleId="Normal">
     <w:name w:val="Normal"/>
     <w:qFormat/>
+    <w:rsid w:val="0001336C"/>
   </w:style>
   <w:style w:type="paragraph" w:styleId="Heading1">
     <w:name w:val="heading 1"/>

</xml_diff>